<commit_message>
9. Oktober GGP Stunde
</commit_message>
<xml_diff>
--- a/GGP/Pratscher-Mitschrift.docx
+++ b/GGP/Pratscher-Mitschrift.docx
@@ -1,8 +1,8 @@
 
 <file path=word/document.xml><?xml version="1.0" encoding="utf-8"?>
-<w:document xmlns:o="urn:schemas-microsoft-com:office:office" xmlns:r="http://schemas.openxmlformats.org/officeDocument/2006/relationships" xmlns:v="urn:schemas-microsoft-com:vml" xmlns:w="http://schemas.openxmlformats.org/wordprocessingml/2006/main" xmlns:w10="urn:schemas-microsoft-com:office:word" xmlns:wp="http://schemas.openxmlformats.org/drawingml/2006/wordprocessingDrawing" xmlns:pic="http://schemas.openxmlformats.org/drawingml/2006/picture" xmlns:wps="http://schemas.microsoft.com/office/word/2010/wordprocessingShape" xmlns:wpg="http://schemas.microsoft.com/office/word/2010/wordprocessingGroup" xmlns:mc="http://schemas.openxmlformats.org/markup-compatibility/2006" xmlns:wp14="http://schemas.microsoft.com/office/word/2010/wordprocessingDrawing" xmlns:w14="http://schemas.microsoft.com/office/word/2010/wordml" xmlns:w15="http://schemas.microsoft.com/office/word/2012/wordml" mc:Ignorable="w14 wp14 w15">
+<w:document xmlns:o="urn:schemas-microsoft-com:office:office" xmlns:r="http://schemas.openxmlformats.org/officeDocument/2006/relationships" xmlns:v="urn:schemas-microsoft-com:vml" xmlns:w="http://schemas.openxmlformats.org/wordprocessingml/2006/main" xmlns:w10="urn:schemas-microsoft-com:office:word" xmlns:wp="http://schemas.openxmlformats.org/drawingml/2006/wordprocessingDrawing" xmlns:pic="http://schemas.openxmlformats.org/drawingml/2006/picture" xmlns:wps="http://schemas.microsoft.com/office/word/2010/wordprocessingShape" xmlns:wpg="http://schemas.microsoft.com/office/word/2010/wordprocessingGroup" xmlns:mc="http://schemas.openxmlformats.org/markup-compatibility/2006" xmlns:wp14="http://schemas.microsoft.com/office/word/2010/wordprocessingDrawing" xmlns:w14="http://schemas.microsoft.com/office/word/2010/wordml" xmlns:w15="http://schemas.microsoft.com/office/word/2012/wordml" xmlns:a="http://schemas.openxmlformats.org/drawingml/2006/main" mc:Ignorable="w14 wp14 w15">
   <w:body>
-    <w:p>
+    <w:p xmlns:wp14="http://schemas.microsoft.com/office/word/2010/wordml" wp14:textId="77777777">
       <w:pPr>
         <w:pStyle w:val="Normal"/>
         <w:jc w:val="center"/>
@@ -13,7 +13,7 @@
         <w:t>Wirtschaftskreislauf</w:t>
       </w:r>
     </w:p>
-    <w:p>
+    <w:p xmlns:wp14="http://schemas.microsoft.com/office/word/2010/wordml" wp14:textId="77777777">
       <w:pPr>
         <w:pStyle w:val="Normal"/>
         <w:jc w:val="start"/>
@@ -28,7 +28,7 @@
         <w:t>Volkswirtschaftlichen Grundlagen:</w:t>
       </w:r>
     </w:p>
-    <w:p>
+    <w:p xmlns:wp14="http://schemas.microsoft.com/office/word/2010/wordml" wp14:textId="77777777">
       <w:pPr>
         <w:pStyle w:val="Normal"/>
         <w:jc w:val="start"/>
@@ -39,7 +39,7 @@
         <w:t>Wie lässt sich Wirtschaft messen?</w:t>
       </w:r>
     </w:p>
-    <w:p>
+    <w:p xmlns:wp14="http://schemas.microsoft.com/office/word/2010/wordml" wp14:textId="77777777">
       <w:pPr>
         <w:pStyle w:val="Normal"/>
         <w:jc w:val="start"/>
@@ -50,7 +50,7 @@
         <w:t>=&gt;Mögliche Kenngrößen: BIP, Inflation, Arbeitslosigkeit, Exportquote</w:t>
       </w:r>
     </w:p>
-    <w:p>
+    <w:p xmlns:wp14="http://schemas.microsoft.com/office/word/2010/wordml" wp14:textId="77777777">
       <w:pPr>
         <w:pStyle w:val="Normal"/>
         <w:ind w:firstLine="708"/>
@@ -70,7 +70,7 @@
         <w:t xml:space="preserve">Statistik Austria </w:t>
       </w:r>
     </w:p>
-    <w:p>
+    <w:p xmlns:wp14="http://schemas.microsoft.com/office/word/2010/wordml" wp14:textId="77777777">
       <w:pPr>
         <w:pStyle w:val="Normal"/>
         <w:ind w:firstLine="708"/>
@@ -86,7 +86,7 @@
         <w:t>=&gt; Arbeitsmarktdaten, Statistiken zur sozialen Lage, Preisentwicklung, BIP</w:t>
       </w:r>
     </w:p>
-    <w:p>
+    <w:p xmlns:wp14="http://schemas.microsoft.com/office/word/2010/wordml" wp14:textId="77777777">
       <w:pPr>
         <w:pStyle w:val="Normal"/>
         <w:ind w:firstLine="708"/>
@@ -102,7 +102,7 @@
         <w:t>EU -&gt; Eurostat, Global -&gt; OECD</w:t>
       </w:r>
     </w:p>
-    <w:p>
+    <w:p xmlns:wp14="http://schemas.microsoft.com/office/word/2010/wordml" wp14:textId="77777777">
       <w:pPr>
         <w:pStyle w:val="Normal"/>
         <w:ind w:firstLine="708"/>
@@ -120,7 +120,7 @@
         <w:t>BIP – Entstehung neuer Werte:</w:t>
       </w:r>
     </w:p>
-    <w:p>
+    <w:p xmlns:wp14="http://schemas.microsoft.com/office/word/2010/wordml" wp14:textId="77777777">
       <w:pPr>
         <w:pStyle w:val="Normal"/>
         <w:ind w:firstLine="708"/>
@@ -136,10 +136,10 @@
         <w:t>BIP = Summe aller Wertschöpfungen in einem Jahr</w:t>
       </w:r>
     </w:p>
-    <w:p>
-      <w:pPr>
-        <w:pStyle w:val="Normal"/>
-        <w:ind w:firstLine="708" w:start="708"/>
+    <w:p xmlns:wp14="http://schemas.microsoft.com/office/word/2010/wordml" wp14:textId="77777777">
+      <w:pPr>
+        <w:pStyle w:val="Normal"/>
+        <w:ind w:start="708" w:firstLine="708"/>
         <w:jc w:val="start"/>
         <w:rPr>
           <w:lang w:val="en-US"/>
@@ -152,10 +152,10 @@
         <w:t>=&gt; was sind Wertschöpfungen?</w:t>
       </w:r>
     </w:p>
-    <w:p>
-      <w:pPr>
-        <w:pStyle w:val="Normal"/>
-        <w:ind w:firstLine="708" w:start="708"/>
+    <w:p xmlns:wp14="http://schemas.microsoft.com/office/word/2010/wordml" wp14:textId="77777777">
+      <w:pPr>
+        <w:pStyle w:val="Normal"/>
+        <w:ind w:start="708" w:firstLine="708"/>
         <w:jc w:val="start"/>
         <w:rPr>
           <w:lang w:val="de-DE"/>
@@ -168,10 +168,10 @@
         <w:t>In einer Volkswirtschaft entstehen neue Produkte und Dienstleistungen</w:t>
       </w:r>
     </w:p>
-    <w:p>
-      <w:pPr>
-        <w:pStyle w:val="Normal"/>
-        <w:ind w:firstLine="708" w:start="708"/>
+    <w:p xmlns:wp14="http://schemas.microsoft.com/office/word/2010/wordml" wp14:textId="77777777">
+      <w:pPr>
+        <w:pStyle w:val="Normal"/>
+        <w:ind w:start="708" w:firstLine="708"/>
         <w:jc w:val="start"/>
         <w:rPr>
           <w:lang w:val="de-DE"/>
@@ -184,7 +184,7 @@
         <w:t>Erschaffung neuer Werte am Beispiel einer Semmel:</w:t>
       </w:r>
     </w:p>
-    <w:p>
+    <w:p xmlns:wp14="http://schemas.microsoft.com/office/word/2010/wordml" wp14:textId="77777777">
       <w:pPr>
         <w:pStyle w:val="Normal"/>
         <w:ind w:start="2124"/>
@@ -200,7 +200,7 @@
         <w:t>Zutaten werden benötigt: Mehl, Salz, Milch, usw. -&gt; Vorleistungen</w:t>
       </w:r>
     </w:p>
-    <w:p>
+    <w:p xmlns:wp14="http://schemas.microsoft.com/office/word/2010/wordml" wp14:textId="77777777">
       <w:pPr>
         <w:pStyle w:val="Normal"/>
         <w:ind w:start="2124"/>
@@ -216,7 +216,7 @@
         <w:t>Es entsteht ein neues Produkt</w:t>
       </w:r>
     </w:p>
-    <w:p>
+    <w:p xmlns:wp14="http://schemas.microsoft.com/office/word/2010/wordml" wp14:textId="77777777">
       <w:pPr>
         <w:pStyle w:val="Normal"/>
         <w:ind w:start="2124"/>
@@ -232,7 +232,7 @@
         <w:t>Kann teurer verkauft werden als die einzelnen Zutaten -&gt; Wertschöpfung</w:t>
       </w:r>
     </w:p>
-    <w:p>
+    <w:p xmlns:wp14="http://schemas.microsoft.com/office/word/2010/wordml" wp14:textId="77777777">
       <w:pPr>
         <w:pStyle w:val="Normal"/>
         <w:ind w:start="2124"/>
@@ -248,7 +248,7 @@
         <w:t>Alle Unternehmen melden ihre Wertschöpfungen</w:t>
       </w:r>
     </w:p>
-    <w:p>
+    <w:p xmlns:wp14="http://schemas.microsoft.com/office/word/2010/wordml" wp14:textId="77777777">
       <w:pPr>
         <w:pStyle w:val="Normal"/>
         <w:ind w:start="1416"/>
@@ -264,7 +264,7 @@
         <w:t>BIP =&gt; gibt den Gesamtwert aller Waren und Dienstleistungen an, die innerhalb eines jahres innerhalb einer Volkswirtschaft hergestellt wurden und dem Endverbrauch (z.b.: Wurstsemmel im Geschäft) dienen.</w:t>
       </w:r>
     </w:p>
-    <w:p>
+    <w:p xmlns:wp14="http://schemas.microsoft.com/office/word/2010/wordml" wp14:textId="77777777">
       <w:pPr>
         <w:pStyle w:val="Normal"/>
         <w:ind w:start="1416"/>
@@ -280,7 +280,7 @@
         <w:t>=&gt; entweder diese oder weiter obenstehende Definition erklären in Stunden wiederholung; ganz  oben stehende braucht aber auch Erklärung zur Wertschöpfung</w:t>
       </w:r>
     </w:p>
-    <w:p>
+    <w:p xmlns:wp14="http://schemas.microsoft.com/office/word/2010/wordml" wp14:textId="77777777">
       <w:pPr>
         <w:pStyle w:val="Normal"/>
         <w:ind w:start="1416"/>
@@ -296,7 +296,7 @@
         <w:t>Maß für Wirtschaftsleistung: Wirtschaftswachstum =&gt; Wachstum des BIPs</w:t>
       </w:r>
     </w:p>
-    <w:p>
+    <w:p xmlns:wp14="http://schemas.microsoft.com/office/word/2010/wordml" wp14:textId="77777777">
       <w:pPr>
         <w:pStyle w:val="Normal"/>
         <w:ind w:start="1416"/>
@@ -312,7 +312,7 @@
         <w:t>Mehr Dienstleistung + Produkte als im vorigen Jahr =&gt; BIP steigt</w:t>
       </w:r>
     </w:p>
-    <w:p>
+    <w:p xmlns:wp14="http://schemas.microsoft.com/office/word/2010/wordml" wp14:textId="77777777">
       <w:pPr>
         <w:pStyle w:val="Normal"/>
         <w:ind w:start="1416"/>
@@ -328,7 +328,7 @@
         <w:t>Höheres BIP != höhere Wirtschaftsleistung</w:t>
       </w:r>
     </w:p>
-    <w:p>
+    <w:p xmlns:wp14="http://schemas.microsoft.com/office/word/2010/wordml" wp14:textId="77777777">
       <w:pPr>
         <w:pStyle w:val="Normal"/>
         <w:ind w:start="708"/>
@@ -344,7 +344,7 @@
         <w:t>03.03.2025</w:t>
       </w:r>
     </w:p>
-    <w:p>
+    <w:p xmlns:wp14="http://schemas.microsoft.com/office/word/2010/wordml" wp14:textId="77777777">
       <w:pPr>
         <w:pStyle w:val="Normal"/>
         <w:ind w:start="708"/>
@@ -360,7 +360,7 @@
         <w:t>BIP nominal = Menge * Preis</w:t>
       </w:r>
     </w:p>
-    <w:p>
+    <w:p xmlns:wp14="http://schemas.microsoft.com/office/word/2010/wordml" wp14:textId="77777777">
       <w:pPr>
         <w:pStyle w:val="Normal"/>
         <w:ind w:start="708"/>
@@ -378,6 +378,9 @@
       <w:r>
         <w:rPr/>
         <w:tab/>
+      </w:r>
+      <w:r>
+        <w:rPr/>
         <w:tab/>
       </w:r>
       <w:r>
@@ -387,7 +390,7 @@
         <w:t>Wirtschaftswachstum festzustellen</w:t>
       </w:r>
     </w:p>
-    <w:p>
+    <w:p xmlns:wp14="http://schemas.microsoft.com/office/word/2010/wordml" wp14:textId="77777777">
       <w:pPr>
         <w:pStyle w:val="Normal"/>
         <w:ind w:start="708"/>
@@ -403,7 +406,7 @@
         <w:t>BIP real = Menge * konstanter Preis</w:t>
       </w:r>
     </w:p>
-    <w:p>
+    <w:p xmlns:wp14="http://schemas.microsoft.com/office/word/2010/wordml" wp14:textId="77777777">
       <w:pPr>
         <w:pStyle w:val="Normal"/>
         <w:ind w:start="708"/>
@@ -419,7 +422,7 @@
         <w:t>Konstante Preis von Basisjahr</w:t>
       </w:r>
     </w:p>
-    <w:p>
+    <w:p xmlns:wp14="http://schemas.microsoft.com/office/word/2010/wordml" wp14:textId="77777777">
       <w:pPr>
         <w:pStyle w:val="Normal"/>
         <w:ind w:start="708"/>
@@ -435,7 +438,7 @@
         <w:t>=&gt; Basisjahr alle 5 Jahre</w:t>
       </w:r>
     </w:p>
-    <w:p>
+    <w:p xmlns:wp14="http://schemas.microsoft.com/office/word/2010/wordml" wp14:textId="77777777">
       <w:pPr>
         <w:pStyle w:val="Normal"/>
         <w:ind w:start="708"/>
@@ -451,10 +454,10 @@
         <w:t>Wodurch BIP Erhöhung?</w:t>
       </w:r>
     </w:p>
-    <w:p>
-      <w:pPr>
-        <w:pStyle w:val="Normal"/>
-        <w:ind w:firstLine="708" w:start="1416"/>
+    <w:p xmlns:wp14="http://schemas.microsoft.com/office/word/2010/wordml" wp14:textId="77777777">
+      <w:pPr>
+        <w:pStyle w:val="Normal"/>
+        <w:ind w:start="1416" w:firstLine="708"/>
         <w:jc w:val="start"/>
         <w:rPr>
           <w:lang w:val="de-DE"/>
@@ -467,10 +470,10 @@
         <w:t>=&gt; Mengensteigerung oder Preissteigerung</w:t>
       </w:r>
     </w:p>
-    <w:p>
-      <w:pPr>
-        <w:pStyle w:val="Normal"/>
-        <w:ind w:hanging="0" w:start="1416"/>
+    <w:p xmlns:wp14="http://schemas.microsoft.com/office/word/2010/wordml" wp14:textId="77777777">
+      <w:pPr>
+        <w:pStyle w:val="Normal"/>
+        <w:ind w:start="1416" w:hanging="0"/>
         <w:jc w:val="start"/>
         <w:rPr>
           <w:lang w:val="de-DE"/>
@@ -483,10 +486,10 @@
         <w:t>BIP Nachteile:</w:t>
       </w:r>
     </w:p>
-    <w:p>
-      <w:pPr>
-        <w:pStyle w:val="Normal"/>
-        <w:ind w:firstLine="708" w:start="1416"/>
+    <w:p xmlns:wp14="http://schemas.microsoft.com/office/word/2010/wordml" wp14:textId="77777777">
+      <w:pPr>
+        <w:pStyle w:val="Normal"/>
+        <w:ind w:start="1416" w:firstLine="708"/>
         <w:jc w:val="start"/>
         <w:rPr>
           <w:lang w:val="de-DE"/>
@@ -499,10 +502,10 @@
         <w:t>Hausarbeit und Schattenwirtschaft nicht berücksichtigt</w:t>
       </w:r>
     </w:p>
-    <w:p>
-      <w:pPr>
-        <w:pStyle w:val="Normal"/>
-        <w:ind w:firstLine="708" w:start="1416"/>
+    <w:p xmlns:wp14="http://schemas.microsoft.com/office/word/2010/wordml" wp14:textId="77777777">
+      <w:pPr>
+        <w:pStyle w:val="Normal"/>
+        <w:ind w:start="1416" w:firstLine="708"/>
         <w:jc w:val="start"/>
         <w:rPr>
           <w:lang w:val="de-DE"/>
@@ -517,6 +520,9 @@
       <w:r>
         <w:rPr/>
         <w:tab/>
+      </w:r>
+      <w:r>
+        <w:rPr/>
         <w:tab/>
       </w:r>
       <w:r>
@@ -526,10 +532,10 @@
         <w:t>obwohl Staat schlecht geht) nicht berücksichtigt</w:t>
       </w:r>
     </w:p>
-    <w:p>
-      <w:pPr>
-        <w:pStyle w:val="Normal"/>
-        <w:ind w:firstLine="708" w:start="1416"/>
+    <w:p xmlns:wp14="http://schemas.microsoft.com/office/word/2010/wordml" wp14:textId="77777777">
+      <w:pPr>
+        <w:pStyle w:val="Normal"/>
+        <w:ind w:start="1416" w:firstLine="708"/>
         <w:jc w:val="start"/>
         <w:rPr>
           <w:lang w:val="de-DE"/>
@@ -542,10 +548,10 @@
         <w:t>Verteilung nicht berücksichtigt</w:t>
       </w:r>
     </w:p>
-    <w:p>
-      <w:pPr>
-        <w:pStyle w:val="Normal"/>
-        <w:ind w:firstLine="708" w:start="1416"/>
+    <w:p xmlns:wp14="http://schemas.microsoft.com/office/word/2010/wordml" wp14:textId="77777777">
+      <w:pPr>
+        <w:pStyle w:val="Normal"/>
+        <w:ind w:start="1416" w:firstLine="708"/>
         <w:jc w:val="start"/>
         <w:rPr>
           <w:lang w:val="de-DE"/>
@@ -558,10 +564,10 @@
         <w:t>(Alles, was nicht in Steuern einfließt)</w:t>
       </w:r>
     </w:p>
-    <w:p>
-      <w:pPr>
-        <w:pStyle w:val="Normal"/>
-        <w:ind w:hanging="0" w:start="1416"/>
+    <w:p xmlns:wp14="http://schemas.microsoft.com/office/word/2010/wordml" wp14:textId="77777777">
+      <w:pPr>
+        <w:pStyle w:val="Normal"/>
+        <w:ind w:start="1416" w:hanging="0"/>
         <w:jc w:val="start"/>
         <w:rPr>
           <w:lang w:val="de-DE"/>
@@ -574,10 +580,10 @@
         <w:t>BIP-Vorteile:</w:t>
       </w:r>
     </w:p>
-    <w:p>
-      <w:pPr>
-        <w:pStyle w:val="Normal"/>
-        <w:ind w:hanging="0" w:start="1416"/>
+    <w:p xmlns:wp14="http://schemas.microsoft.com/office/word/2010/wordml" wp14:textId="77777777">
+      <w:pPr>
+        <w:pStyle w:val="Normal"/>
+        <w:ind w:start="1416" w:hanging="0"/>
         <w:jc w:val="start"/>
         <w:rPr>
           <w:lang w:val="de-DE"/>
@@ -590,10 +596,10 @@
         <w:t>Gutes Maß</w:t>
       </w:r>
     </w:p>
-    <w:p>
-      <w:pPr>
-        <w:pStyle w:val="Normal"/>
-        <w:ind w:hanging="0" w:start="1416"/>
+    <w:p xmlns:wp14="http://schemas.microsoft.com/office/word/2010/wordml" wp14:textId="77777777">
+      <w:pPr>
+        <w:pStyle w:val="Normal"/>
+        <w:ind w:start="1416" w:hanging="0"/>
         <w:jc w:val="start"/>
         <w:rPr>
           <w:lang w:val="de-DE"/>
@@ -608,6 +614,9 @@
       <w:r>
         <w:rPr/>
         <w:tab/>
+      </w:r>
+      <w:r>
+        <w:rPr/>
         <w:tab/>
       </w:r>
       <w:r>
@@ -617,10 +626,10 @@
         <w:t>Arbeitslosenrat, Analphabetenrate, Lebenserwartung)</w:t>
       </w:r>
     </w:p>
-    <w:p>
-      <w:pPr>
-        <w:pStyle w:val="Normal"/>
-        <w:ind w:hanging="0" w:start="1416"/>
+    <w:p xmlns:wp14="http://schemas.microsoft.com/office/word/2010/wordml" wp14:textId="77777777">
+      <w:pPr>
+        <w:pStyle w:val="Normal"/>
+        <w:ind w:start="1416" w:hanging="0"/>
         <w:jc w:val="start"/>
         <w:rPr>
           <w:lang w:val="de-DE"/>
@@ -633,10 +642,10 @@
         <w:t>Internationale Vergleiche =&gt; BIP / Kopf =&gt; Ungleichverteilung, geringe Aussagekraft</w:t>
       </w:r>
     </w:p>
-    <w:p>
-      <w:pPr>
-        <w:pStyle w:val="Normal"/>
-        <w:ind w:hanging="0" w:start="1416"/>
+    <w:p xmlns:wp14="http://schemas.microsoft.com/office/word/2010/wordml" wp14:textId="77777777">
+      <w:pPr>
+        <w:pStyle w:val="Normal"/>
+        <w:ind w:start="1416" w:hanging="0"/>
         <w:jc w:val="start"/>
         <w:rPr>
           <w:lang w:val="de-DE"/>
@@ -649,10 +658,10 @@
         <w:t>Alternativ:</w:t>
       </w:r>
     </w:p>
-    <w:p>
-      <w:pPr>
-        <w:pStyle w:val="Normal"/>
-        <w:ind w:hanging="0" w:start="1416"/>
+    <w:p xmlns:wp14="http://schemas.microsoft.com/office/word/2010/wordml" wp14:textId="77777777">
+      <w:pPr>
+        <w:pStyle w:val="Normal"/>
+        <w:ind w:start="1416" w:hanging="0"/>
         <w:jc w:val="start"/>
         <w:rPr>
           <w:lang w:val="de-DE"/>
@@ -665,10 +674,10 @@
         <w:t>BIP 2.0 Haus- und Freiwilligenarbeit, Einkommensverteilung und Umweltaspekte berücksichtigt</w:t>
       </w:r>
     </w:p>
-    <w:p>
-      <w:pPr>
-        <w:pStyle w:val="Normal"/>
-        <w:ind w:hanging="0" w:start="1416"/>
+    <w:p xmlns:wp14="http://schemas.microsoft.com/office/word/2010/wordml" wp14:textId="77777777">
+      <w:pPr>
+        <w:pStyle w:val="Normal"/>
+        <w:ind w:start="1416" w:hanging="0"/>
         <w:jc w:val="start"/>
         <w:rPr>
           <w:lang w:val="de-DE"/>
@@ -681,10 +690,10 @@
         <w:t>Human Development Index (1. Klasse)</w:t>
       </w:r>
     </w:p>
-    <w:p>
-      <w:pPr>
-        <w:pStyle w:val="Normal"/>
-        <w:ind w:hanging="0" w:start="1416"/>
+    <w:p xmlns:wp14="http://schemas.microsoft.com/office/word/2010/wordml" wp14:textId="77777777">
+      <w:pPr>
+        <w:pStyle w:val="Normal"/>
+        <w:ind w:start="1416" w:hanging="0"/>
         <w:jc w:val="start"/>
         <w:rPr>
           <w:lang w:val="de-DE"/>
@@ -697,10 +706,10 @@
         <w:t>HPI (Happy Planet Index): Inklusive:</w:t>
       </w:r>
     </w:p>
-    <w:p>
-      <w:pPr>
-        <w:pStyle w:val="Normal"/>
-        <w:ind w:hanging="0" w:start="1416"/>
+    <w:p xmlns:wp14="http://schemas.microsoft.com/office/word/2010/wordml" wp14:textId="77777777">
+      <w:pPr>
+        <w:pStyle w:val="Normal"/>
+        <w:ind w:start="1416" w:hanging="0"/>
         <w:jc w:val="start"/>
         <w:rPr>
           <w:lang w:val="de-DE"/>
@@ -713,10 +722,10 @@
         <w:t>Nachhaltigkeit</w:t>
       </w:r>
     </w:p>
-    <w:p>
-      <w:pPr>
-        <w:pStyle w:val="Normal"/>
-        <w:ind w:hanging="0" w:start="1416"/>
+    <w:p xmlns:wp14="http://schemas.microsoft.com/office/word/2010/wordml" wp14:textId="77777777">
+      <w:pPr>
+        <w:pStyle w:val="Normal"/>
+        <w:ind w:start="1416" w:hanging="0"/>
         <w:jc w:val="start"/>
         <w:rPr>
           <w:lang w:val="de-DE"/>
@@ -731,6 +740,9 @@
       <w:r>
         <w:rPr/>
         <w:tab/>
+      </w:r>
+      <w:r>
+        <w:rPr/>
         <w:tab/>
       </w:r>
       <w:r>
@@ -740,10 +752,10 @@
         <w:t>sozialen Grundsätzen)</w:t>
       </w:r>
     </w:p>
-    <w:p>
-      <w:pPr>
-        <w:pStyle w:val="Normal"/>
-        <w:ind w:hanging="0" w:start="1416"/>
+    <w:p xmlns:wp14="http://schemas.microsoft.com/office/word/2010/wordml" wp14:textId="77777777">
+      <w:pPr>
+        <w:pStyle w:val="Normal"/>
+        <w:ind w:start="1416" w:hanging="0"/>
         <w:jc w:val="start"/>
         <w:rPr>
           <w:lang w:val="de-DE"/>
@@ -756,10 +768,10 @@
         <w:t>Gini-Koeffizient:</w:t>
       </w:r>
     </w:p>
-    <w:p>
-      <w:pPr>
-        <w:pStyle w:val="Normal"/>
-        <w:ind w:hanging="0" w:start="1416"/>
+    <w:p xmlns:wp14="http://schemas.microsoft.com/office/word/2010/wordml" wp14:textId="77777777">
+      <w:pPr>
+        <w:pStyle w:val="Normal"/>
+        <w:ind w:start="1416" w:hanging="0"/>
         <w:jc w:val="start"/>
         <w:rPr>
           <w:lang w:val="de-DE"/>
@@ -772,10 +784,10 @@
         <w:t>Bildet Einkommensanteile der verschiedenen Bevölkerungsgruppen ab und soll damit ein Maß für Ungleichheit in einer Gesellschaft sein. Der Gini-Koeffizient (wird aus der Lorenzkurve abgeleitet und) nimmt einen Wert zwischen 0 und 1 an. Je näher der Wert bei 0 ist, umso gleicher ist das Einkommen verteilt.</w:t>
       </w:r>
     </w:p>
-    <w:p>
-      <w:pPr>
-        <w:pStyle w:val="Normal"/>
-        <w:ind w:hanging="0" w:start="1416"/>
+    <w:p xmlns:wp14="http://schemas.microsoft.com/office/word/2010/wordml" wp14:textId="77777777">
+      <w:pPr>
+        <w:pStyle w:val="Normal"/>
+        <w:ind w:start="1416" w:hanging="0"/>
         <w:jc w:val="start"/>
         <w:rPr>
           <w:lang w:val="de-DE"/>
@@ -788,10 +800,10 @@
         <w:t>Transferleistung = Staatshilfe</w:t>
       </w:r>
     </w:p>
-    <w:p>
-      <w:pPr>
-        <w:pStyle w:val="Normal"/>
-        <w:ind w:hanging="0" w:start="1416"/>
+    <w:p xmlns:wp14="http://schemas.microsoft.com/office/word/2010/wordml" wp14:textId="77777777">
+      <w:pPr>
+        <w:pStyle w:val="Normal"/>
+        <w:ind w:start="1416" w:hanging="0"/>
         <w:jc w:val="start"/>
         <w:rPr>
           <w:lang w:val="de-DE"/>
@@ -804,10 +816,10 @@
         <w:t>Auf und Ab in der Wirtschaft</w:t>
       </w:r>
     </w:p>
-    <w:p>
-      <w:pPr>
-        <w:pStyle w:val="Normal"/>
-        <w:ind w:hanging="0" w:start="1416"/>
+    <w:p xmlns:wp14="http://schemas.microsoft.com/office/word/2010/wordml" wp14:textId="77777777">
+      <w:pPr>
+        <w:pStyle w:val="Normal"/>
+        <w:ind w:start="1416" w:hanging="0"/>
         <w:jc w:val="start"/>
         <w:rPr>
           <w:lang w:val="de-DE"/>
@@ -820,10 +832,10 @@
         <w:t>Konjunkturzyklen</w:t>
       </w:r>
     </w:p>
-    <w:p>
-      <w:pPr>
-        <w:pStyle w:val="Normal"/>
-        <w:ind w:hanging="0" w:start="1416"/>
+    <w:p xmlns:wp14="http://schemas.microsoft.com/office/word/2010/wordml" wp14:textId="77777777">
+      <w:pPr>
+        <w:pStyle w:val="Normal"/>
+        <w:ind w:start="1416" w:hanging="0"/>
         <w:jc w:val="start"/>
         <w:rPr>
           <w:lang w:val="de-DE"/>
@@ -836,10 +848,10 @@
         <w:t>Konjunktur = Wirtschaftslage in einem Staat</w:t>
       </w:r>
     </w:p>
-    <w:p>
-      <w:pPr>
-        <w:pStyle w:val="Normal"/>
-        <w:ind w:hanging="0" w:start="1416"/>
+    <w:p xmlns:wp14="http://schemas.microsoft.com/office/word/2010/wordml" wp14:textId="77777777">
+      <w:pPr>
+        <w:pStyle w:val="Normal"/>
+        <w:ind w:start="1416" w:hanging="0"/>
         <w:jc w:val="start"/>
         <w:rPr>
           <w:lang w:val="de-DE"/>
@@ -852,10 +864,10 @@
         <w:t>Wird beeinflusst durch:</w:t>
       </w:r>
     </w:p>
-    <w:p>
-      <w:pPr>
-        <w:pStyle w:val="Normal"/>
-        <w:ind w:hanging="0" w:start="1416"/>
+    <w:p xmlns:wp14="http://schemas.microsoft.com/office/word/2010/wordml" wp14:textId="77777777">
+      <w:pPr>
+        <w:pStyle w:val="Normal"/>
+        <w:ind w:start="1416" w:hanging="0"/>
         <w:jc w:val="start"/>
         <w:rPr>
           <w:lang w:val="de-DE"/>
@@ -868,10 +880,10 @@
         <w:t>Wirtschaftswachstum</w:t>
       </w:r>
     </w:p>
-    <w:p>
-      <w:pPr>
-        <w:pStyle w:val="Normal"/>
-        <w:ind w:hanging="0" w:start="1416"/>
+    <w:p xmlns:wp14="http://schemas.microsoft.com/office/word/2010/wordml" wp14:textId="77777777">
+      <w:pPr>
+        <w:pStyle w:val="Normal"/>
+        <w:ind w:start="1416" w:hanging="0"/>
         <w:jc w:val="start"/>
         <w:rPr>
           <w:lang w:val="de-DE"/>
@@ -884,10 +896,10 @@
         <w:t>Preisentwicklung</w:t>
       </w:r>
     </w:p>
-    <w:p>
-      <w:pPr>
-        <w:pStyle w:val="Normal"/>
-        <w:ind w:hanging="0" w:start="1416"/>
+    <w:p xmlns:wp14="http://schemas.microsoft.com/office/word/2010/wordml" wp14:textId="77777777">
+      <w:pPr>
+        <w:pStyle w:val="Normal"/>
+        <w:ind w:start="1416" w:hanging="0"/>
         <w:jc w:val="start"/>
         <w:rPr>
           <w:lang w:val="de-DE"/>
@@ -900,10 +912,10 @@
         <w:t>Einkommen</w:t>
       </w:r>
     </w:p>
-    <w:p>
-      <w:pPr>
-        <w:pStyle w:val="Normal"/>
-        <w:ind w:hanging="0" w:start="1416"/>
+    <w:p xmlns:wp14="http://schemas.microsoft.com/office/word/2010/wordml" wp14:textId="77777777">
+      <w:pPr>
+        <w:pStyle w:val="Normal"/>
+        <w:ind w:start="1416" w:hanging="0"/>
         <w:jc w:val="start"/>
         <w:rPr>
           <w:lang w:val="de-DE"/>
@@ -916,10 +928,10 @@
         <w:t>Entwicklung BIP stellt Konjunkturverlauf dar</w:t>
       </w:r>
     </w:p>
-    <w:p>
-      <w:pPr>
-        <w:pStyle w:val="Normal"/>
-        <w:ind w:hanging="0" w:start="1416"/>
+    <w:p xmlns:wp14="http://schemas.microsoft.com/office/word/2010/wordml" wp14:textId="77777777">
+      <w:pPr>
+        <w:pStyle w:val="Normal"/>
+        <w:ind w:start="1416" w:hanging="0"/>
         <w:jc w:val="start"/>
         <w:rPr>
           <w:lang w:val="de-DE"/>
@@ -932,10 +944,10 @@
         <w:t>Nicht gleichmäßig</w:t>
       </w:r>
     </w:p>
-    <w:p>
-      <w:pPr>
-        <w:pStyle w:val="Normal"/>
-        <w:ind w:hanging="0" w:start="1416"/>
+    <w:p xmlns:wp14="http://schemas.microsoft.com/office/word/2010/wordml" wp14:textId="77777777">
+      <w:pPr>
+        <w:pStyle w:val="Normal"/>
+        <w:ind w:start="1416" w:hanging="0"/>
         <w:jc w:val="start"/>
         <w:rPr>
           <w:lang w:val="de-DE"/>
@@ -948,10 +960,10 @@
         <w:t>Auf und Abwärtsbewegungen erstrecken sich über mehrere Jahre</w:t>
       </w:r>
     </w:p>
-    <w:p>
-      <w:pPr>
-        <w:pStyle w:val="Normal"/>
-        <w:ind w:hanging="0" w:start="1416"/>
+    <w:p xmlns:wp14="http://schemas.microsoft.com/office/word/2010/wordml" wp14:textId="77777777">
+      <w:pPr>
+        <w:pStyle w:val="Normal"/>
+        <w:ind w:start="1416" w:hanging="0"/>
         <w:jc w:val="start"/>
         <w:rPr>
           <w:lang w:val="de-DE"/>
@@ -964,10 +976,10 @@
         <w:t>(Grafik)</w:t>
       </w:r>
     </w:p>
-    <w:p>
-      <w:pPr>
-        <w:pStyle w:val="Normal"/>
-        <w:ind w:hanging="0" w:start="708"/>
+    <w:p xmlns:wp14="http://schemas.microsoft.com/office/word/2010/wordml" wp14:textId="77777777">
+      <w:pPr>
+        <w:pStyle w:val="Normal"/>
+        <w:ind w:start="708" w:hanging="0"/>
         <w:jc w:val="start"/>
         <w:rPr>
           <w:lang w:val="de-DE"/>
@@ -980,10 +992,10 @@
         <w:t>14.5.2025:</w:t>
       </w:r>
     </w:p>
-    <w:p>
-      <w:pPr>
-        <w:pStyle w:val="Normal"/>
-        <w:ind w:hanging="0" w:start="708"/>
+    <w:p xmlns:wp14="http://schemas.microsoft.com/office/word/2010/wordml" wp14:textId="77777777">
+      <w:pPr>
+        <w:pStyle w:val="Normal"/>
+        <w:ind w:start="708" w:hanging="0"/>
         <w:jc w:val="start"/>
         <w:rPr>
           <w:lang w:val="de-DE"/>
@@ -996,10 +1008,10 @@
         <w:t>Phase – Aufschwung, Expansion:</w:t>
       </w:r>
     </w:p>
-    <w:p>
-      <w:pPr>
-        <w:pStyle w:val="Normal"/>
-        <w:ind w:firstLine="708" w:start="708"/>
+    <w:p xmlns:wp14="http://schemas.microsoft.com/office/word/2010/wordml" wp14:textId="77777777">
+      <w:pPr>
+        <w:pStyle w:val="Normal"/>
+        <w:ind w:start="708" w:firstLine="708"/>
         <w:jc w:val="start"/>
         <w:rPr>
           <w:lang w:val="de-DE"/>
@@ -1012,10 +1024,10 @@
         <w:t>Niedrige Rohstoffpreise, Löhne und Zinsen</w:t>
       </w:r>
     </w:p>
-    <w:p>
-      <w:pPr>
-        <w:pStyle w:val="Normal"/>
-        <w:ind w:firstLine="708" w:start="708"/>
+    <w:p xmlns:wp14="http://schemas.microsoft.com/office/word/2010/wordml" wp14:textId="77777777">
+      <w:pPr>
+        <w:pStyle w:val="Normal"/>
+        <w:ind w:start="708" w:firstLine="708"/>
         <w:jc w:val="start"/>
         <w:rPr>
           <w:lang w:val="de-DE"/>
@@ -1028,10 +1040,10 @@
         <w:t>Neue Produktionsimpulse für Unternehmen</w:t>
       </w:r>
     </w:p>
-    <w:p>
-      <w:pPr>
-        <w:pStyle w:val="Normal"/>
-        <w:ind w:firstLine="708" w:start="708"/>
+    <w:p xmlns:wp14="http://schemas.microsoft.com/office/word/2010/wordml" wp14:textId="77777777">
+      <w:pPr>
+        <w:pStyle w:val="Normal"/>
+        <w:ind w:start="708" w:firstLine="708"/>
         <w:jc w:val="start"/>
         <w:rPr>
           <w:lang w:val="de-DE"/>
@@ -1044,10 +1056,10 @@
         <w:t>Erweiterung der Produktion</w:t>
       </w:r>
     </w:p>
-    <w:p>
-      <w:pPr>
-        <w:pStyle w:val="Normal"/>
-        <w:ind w:firstLine="708" w:start="708"/>
+    <w:p xmlns:wp14="http://schemas.microsoft.com/office/word/2010/wordml" wp14:textId="77777777">
+      <w:pPr>
+        <w:pStyle w:val="Normal"/>
+        <w:ind w:start="708" w:firstLine="708"/>
         <w:jc w:val="start"/>
         <w:rPr>
           <w:lang w:val="de-DE"/>
@@ -1060,10 +1072,10 @@
         <w:t>Wiedereinstellung von Arbeitskräften, erhöhte Nachfrage am Markt</w:t>
       </w:r>
     </w:p>
-    <w:p>
-      <w:pPr>
-        <w:pStyle w:val="Normal"/>
-        <w:ind w:hanging="0" w:start="708"/>
+    <w:p xmlns:wp14="http://schemas.microsoft.com/office/word/2010/wordml" wp14:textId="77777777">
+      <w:pPr>
+        <w:pStyle w:val="Normal"/>
+        <w:ind w:start="708" w:hanging="0"/>
         <w:jc w:val="start"/>
         <w:rPr>
           <w:lang w:val="de-DE"/>
@@ -1076,10 +1088,10 @@
         <w:t>Phase – Hochkonjunktur, Boom</w:t>
       </w:r>
     </w:p>
-    <w:p>
-      <w:pPr>
-        <w:pStyle w:val="Normal"/>
-        <w:ind w:hanging="0" w:start="708"/>
+    <w:p xmlns:wp14="http://schemas.microsoft.com/office/word/2010/wordml" wp14:textId="77777777">
+      <w:pPr>
+        <w:pStyle w:val="Normal"/>
+        <w:ind w:start="708" w:hanging="0"/>
         <w:jc w:val="start"/>
         <w:rPr>
           <w:lang w:val="de-DE"/>
@@ -1092,10 +1104,10 @@
         <w:t>Vollbeschäftigung,überbeschäftigung</w:t>
       </w:r>
     </w:p>
-    <w:p>
-      <w:pPr>
-        <w:pStyle w:val="Normal"/>
-        <w:ind w:hanging="0" w:start="708"/>
+    <w:p xmlns:wp14="http://schemas.microsoft.com/office/word/2010/wordml" wp14:textId="77777777">
+      <w:pPr>
+        <w:pStyle w:val="Normal"/>
+        <w:ind w:start="708" w:hanging="0"/>
         <w:jc w:val="start"/>
         <w:rPr>
           <w:lang w:val="de-DE"/>
@@ -1108,10 +1120,10 @@
         <w:t>Anwachsende Produktion</w:t>
       </w:r>
     </w:p>
-    <w:p>
-      <w:pPr>
-        <w:pStyle w:val="Normal"/>
-        <w:ind w:hanging="0" w:start="708"/>
+    <w:p xmlns:wp14="http://schemas.microsoft.com/office/word/2010/wordml" wp14:textId="77777777">
+      <w:pPr>
+        <w:pStyle w:val="Normal"/>
+        <w:ind w:start="708" w:hanging="0"/>
         <w:jc w:val="start"/>
         <w:rPr>
           <w:lang w:val="de-DE"/>
@@ -1124,10 +1136,10 @@
         <w:t>Hohe Löhne, hohe Zinsen</w:t>
       </w:r>
     </w:p>
-    <w:p>
-      <w:pPr>
-        <w:pStyle w:val="Normal"/>
-        <w:ind w:hanging="0" w:start="708"/>
+    <w:p xmlns:wp14="http://schemas.microsoft.com/office/word/2010/wordml" wp14:textId="77777777">
+      <w:pPr>
+        <w:pStyle w:val="Normal"/>
+        <w:ind w:start="708" w:hanging="0"/>
         <w:jc w:val="start"/>
         <w:rPr>
           <w:lang w:val="de-DE"/>
@@ -1140,10 +1152,10 @@
         <w:t>Angebot an Rohstoffen und Kapitalgütern übersteigt die Nachfrage</w:t>
       </w:r>
     </w:p>
-    <w:p>
-      <w:pPr>
-        <w:pStyle w:val="Normal"/>
-        <w:ind w:hanging="0" w:start="708"/>
+    <w:p xmlns:wp14="http://schemas.microsoft.com/office/word/2010/wordml" wp14:textId="77777777">
+      <w:pPr>
+        <w:pStyle w:val="Normal"/>
+        <w:ind w:start="708" w:hanging="0"/>
         <w:jc w:val="start"/>
         <w:rPr>
           <w:lang w:val="de-DE"/>
@@ -1156,10 +1168,10 @@
         <w:t>2.2 Bedürfnisse und Werbung</w:t>
       </w:r>
     </w:p>
-    <w:p>
-      <w:pPr>
-        <w:pStyle w:val="Normal"/>
-        <w:ind w:hanging="0" w:start="708"/>
+    <w:p xmlns:wp14="http://schemas.microsoft.com/office/word/2010/wordml" wp14:textId="77777777">
+      <w:pPr>
+        <w:pStyle w:val="Normal"/>
+        <w:ind w:start="708" w:hanging="0"/>
         <w:jc w:val="start"/>
         <w:rPr>
           <w:lang w:val="de-DE"/>
@@ -1172,10 +1184,10 @@
         <w:t>Wirtschaft ist für die Befriedigung der Bedürfnisse enorm wichtig</w:t>
       </w:r>
     </w:p>
-    <w:p>
-      <w:pPr>
-        <w:pStyle w:val="Normal"/>
-        <w:ind w:hanging="0" w:start="708"/>
+    <w:p xmlns:wp14="http://schemas.microsoft.com/office/word/2010/wordml" wp14:textId="77777777">
+      <w:pPr>
+        <w:pStyle w:val="Normal"/>
+        <w:ind w:start="708" w:hanging="0"/>
         <w:jc w:val="start"/>
         <w:rPr>
           <w:lang w:val="de-DE"/>
@@ -1198,17 +1210,17 @@
         <w:t>Güter zur Verfügung stehen.</w:t>
       </w:r>
     </w:p>
-    <w:p>
-      <w:pPr>
-        <w:pStyle w:val="Normal"/>
-        <w:ind w:hanging="0" w:start="708"/>
+    <w:p xmlns:wp14="http://schemas.microsoft.com/office/word/2010/wordml" wp14:textId="77777777">
+      <w:pPr>
+        <w:pStyle w:val="Normal"/>
+        <w:ind w:start="708" w:hanging="0"/>
         <w:jc w:val="start"/>
         <w:rPr/>
       </w:pPr>
       <w:r>
         <w:rPr/>
         <w:drawing>
-          <wp:inline distT="0" distB="0" distL="0" distR="0">
+          <wp:inline xmlns:wp14="http://schemas.microsoft.com/office/word/2010/wordprocessingDrawing" distT="0" distB="0" distL="0" distR="0" wp14:anchorId="03EB4C4D" wp14:editId="7777777">
             <wp:extent cx="5724525" cy="3228975"/>
             <wp:effectExtent l="0" t="0" r="0" b="0"/>
             <wp:docPr id="1" name="Image1" descr="maslows_beduerfnispyramide"/>
@@ -1247,10 +1259,10 @@
         </w:drawing>
       </w:r>
     </w:p>
-    <w:p>
-      <w:pPr>
-        <w:pStyle w:val="Normal"/>
-        <w:ind w:hanging="0" w:start="708"/>
+    <w:p xmlns:wp14="http://schemas.microsoft.com/office/word/2010/wordml" wp14:textId="77777777">
+      <w:pPr>
+        <w:pStyle w:val="Normal"/>
+        <w:ind w:start="708" w:hanging="0"/>
         <w:jc w:val="start"/>
         <w:rPr/>
       </w:pPr>
@@ -1259,10 +1271,10 @@
         <w:t>Viele Bedürfnisse, aber begrenzt verfügbar -&gt; z.B. Gold, Silber, Öl, Bitcoin, usw...</w:t>
       </w:r>
     </w:p>
-    <w:p>
-      <w:pPr>
-        <w:pStyle w:val="Normal"/>
-        <w:ind w:hanging="0" w:start="708"/>
+    <w:p xmlns:wp14="http://schemas.microsoft.com/office/word/2010/wordml" wp14:textId="77777777">
+      <w:pPr>
+        <w:pStyle w:val="Normal"/>
+        <w:ind w:start="708" w:hanging="0"/>
         <w:jc w:val="start"/>
         <w:rPr/>
       </w:pPr>
@@ -1271,55 +1283,82 @@
         <w:t>Preis steigt</w:t>
       </w:r>
     </w:p>
-    <w:p>
-      <w:pPr>
-        <w:pStyle w:val="Normal"/>
-        <w:ind w:hanging="0" w:start="708"/>
+    <w:p xmlns:wp14="http://schemas.microsoft.com/office/word/2010/wordml" wp14:textId="77777777">
+      <w:pPr>
+        <w:pStyle w:val="Normal"/>
+        <w:ind w:start="708" w:hanging="0"/>
         <w:jc w:val="start"/>
         <w:rPr/>
       </w:pPr>
       <w:r>
         <w:rPr/>
         <w:t xml:space="preserve">Ökonomisches Handeln wird notwendig -&gt; Verhältnis zwischen </w:t>
-        <w:tab/>
-        <w:tab/>
+      </w:r>
+      <w:r>
+        <w:rPr/>
+        <w:tab/>
+      </w:r>
+      <w:r>
+        <w:rPr/>
+        <w:tab/>
+      </w:r>
+      <w:r>
+        <w:rPr/>
         <w:t xml:space="preserve">eingesetzten Mittel (Ressourcen, Kapital oder Arbeitskraft -&gt; Input) und </w:t>
-        <w:tab/>
+      </w:r>
+      <w:r>
+        <w:rPr/>
+        <w:tab/>
+      </w:r>
+      <w:r>
+        <w:rPr/>
         <w:t>Erfolg (Output)</w:t>
       </w:r>
     </w:p>
-    <w:p>
-      <w:pPr>
-        <w:pStyle w:val="Normal"/>
-        <w:ind w:hanging="0" w:start="708"/>
+    <w:p xmlns:wp14="http://schemas.microsoft.com/office/word/2010/wordml" wp14:textId="77777777">
+      <w:pPr>
+        <w:pStyle w:val="Normal"/>
+        <w:ind w:start="708" w:hanging="0"/>
         <w:jc w:val="start"/>
         <w:rPr/>
       </w:pPr>
       <w:r>
         <w:rPr/>
         <w:t xml:space="preserve">Minimalprinzip -&gt; ein Ziel vorgegeben, so wenig wie möglich benutzt, um </w:t>
-        <w:tab/>
+      </w:r>
+      <w:r>
+        <w:rPr/>
+        <w:tab/>
+      </w:r>
+      <w:r>
+        <w:rPr/>
         <w:t>Ziel zu erreichen</w:t>
       </w:r>
     </w:p>
-    <w:p>
-      <w:pPr>
-        <w:pStyle w:val="Normal"/>
-        <w:ind w:hanging="0" w:start="708"/>
+    <w:p xmlns:wp14="http://schemas.microsoft.com/office/word/2010/wordml" wp14:textId="77777777">
+      <w:pPr>
+        <w:pStyle w:val="Normal"/>
+        <w:ind w:start="708" w:hanging="0"/>
         <w:jc w:val="start"/>
         <w:rPr/>
       </w:pPr>
       <w:r>
         <w:rPr/>
         <w:t xml:space="preserve">Maximalprinzip -&gt; Mittel sind vorgegeben, möglichst hoher Output soll </w:t>
-        <w:tab/>
+      </w:r>
+      <w:r>
+        <w:rPr/>
+        <w:tab/>
+      </w:r>
+      <w:r>
+        <w:rPr/>
         <w:t>erreicht werden</w:t>
       </w:r>
     </w:p>
-    <w:p>
-      <w:pPr>
-        <w:pStyle w:val="Normal"/>
-        <w:ind w:hanging="0" w:start="708"/>
+    <w:p xmlns:wp14="http://schemas.microsoft.com/office/word/2010/wordml" wp14:textId="77777777">
+      <w:pPr>
+        <w:pStyle w:val="Normal"/>
+        <w:ind w:start="708" w:hanging="0"/>
         <w:jc w:val="start"/>
         <w:rPr/>
       </w:pPr>
@@ -1328,10 +1367,10 @@
         <w:t>21.5.2025:</w:t>
       </w:r>
     </w:p>
-    <w:p>
-      <w:pPr>
-        <w:pStyle w:val="Normal"/>
-        <w:ind w:hanging="0" w:start="708"/>
+    <w:p xmlns:wp14="http://schemas.microsoft.com/office/word/2010/wordml" wp14:textId="77777777">
+      <w:pPr>
+        <w:pStyle w:val="Normal"/>
+        <w:ind w:start="708" w:hanging="0"/>
         <w:jc w:val="start"/>
         <w:rPr/>
       </w:pPr>
@@ -1340,10 +1379,10 @@
         <w:t>3 Fragen zu Wirtschaft stellen und 3 Plus bekommen</w:t>
       </w:r>
     </w:p>
-    <w:p>
-      <w:pPr>
-        <w:pStyle w:val="Normal"/>
-        <w:ind w:hanging="0" w:start="708"/>
+    <w:p xmlns:wp14="http://schemas.microsoft.com/office/word/2010/wordml" wp14:textId="77777777">
+      <w:pPr>
+        <w:pStyle w:val="Normal"/>
+        <w:ind w:start="708" w:hanging="0"/>
         <w:jc w:val="start"/>
         <w:rPr/>
       </w:pPr>
@@ -1352,10 +1391,10 @@
         <w:t>04.06.2025</w:t>
       </w:r>
     </w:p>
-    <w:p>
-      <w:pPr>
-        <w:pStyle w:val="Normal"/>
-        <w:ind w:hanging="0" w:start="0"/>
+    <w:p xmlns:wp14="http://schemas.microsoft.com/office/word/2010/wordml" wp14:textId="77777777">
+      <w:pPr>
+        <w:pStyle w:val="Normal"/>
+        <w:ind w:start="0" w:hanging="0"/>
         <w:jc w:val="start"/>
         <w:rPr/>
       </w:pPr>
@@ -1364,10 +1403,10 @@
         <w:t>Werbung:</w:t>
       </w:r>
     </w:p>
-    <w:p>
-      <w:pPr>
-        <w:pStyle w:val="Normal"/>
-        <w:ind w:hanging="0" w:start="708"/>
+    <w:p xmlns:wp14="http://schemas.microsoft.com/office/word/2010/wordml" wp14:textId="77777777">
+      <w:pPr>
+        <w:pStyle w:val="Normal"/>
+        <w:ind w:start="708" w:hanging="0"/>
         <w:jc w:val="start"/>
         <w:rPr/>
       </w:pPr>
@@ -1376,10 +1415,10 @@
         <w:t>Entwicklung zu noch mehr Markenbewusstsein bei Kindern und Jugendlichen</w:t>
       </w:r>
     </w:p>
-    <w:p>
-      <w:pPr>
-        <w:pStyle w:val="Normal"/>
-        <w:ind w:hanging="0" w:start="708"/>
+    <w:p xmlns:wp14="http://schemas.microsoft.com/office/word/2010/wordml" wp14:textId="77777777">
+      <w:pPr>
+        <w:pStyle w:val="Normal"/>
+        <w:ind w:start="708" w:hanging="0"/>
         <w:jc w:val="start"/>
         <w:rPr/>
       </w:pPr>
@@ -1388,10 +1427,10 @@
         <w:t>Konsum von K&amp;J wird immer wichtiger</w:t>
       </w:r>
     </w:p>
-    <w:p>
-      <w:pPr>
-        <w:pStyle w:val="Normal"/>
-        <w:ind w:hanging="0" w:start="708"/>
+    <w:p xmlns:wp14="http://schemas.microsoft.com/office/word/2010/wordml" wp14:textId="77777777">
+      <w:pPr>
+        <w:pStyle w:val="Normal"/>
+        <w:ind w:start="708" w:hanging="0"/>
         <w:jc w:val="start"/>
         <w:rPr/>
       </w:pPr>
@@ -1400,10 +1439,10 @@
         <w:t>Ziele von Werbung:</w:t>
       </w:r>
     </w:p>
-    <w:p>
-      <w:pPr>
-        <w:pStyle w:val="Normal"/>
-        <w:ind w:hanging="0" w:start="708"/>
+    <w:p xmlns:wp14="http://schemas.microsoft.com/office/word/2010/wordml" wp14:textId="77777777">
+      <w:pPr>
+        <w:pStyle w:val="Normal"/>
+        <w:ind w:start="708" w:hanging="0"/>
         <w:jc w:val="start"/>
         <w:rPr/>
       </w:pPr>
@@ -1412,10 +1451,10 @@
         <w:t>Absatz fördern und sichern</w:t>
       </w:r>
     </w:p>
-    <w:p>
-      <w:pPr>
-        <w:pStyle w:val="Normal"/>
-        <w:ind w:hanging="0" w:start="708"/>
+    <w:p xmlns:wp14="http://schemas.microsoft.com/office/word/2010/wordml" wp14:textId="77777777">
+      <w:pPr>
+        <w:pStyle w:val="Normal"/>
+        <w:ind w:start="708" w:hanging="0"/>
         <w:jc w:val="start"/>
         <w:rPr/>
       </w:pPr>
@@ -1424,10 +1463,10 @@
         <w:t>Bedürfnisse wecken</w:t>
       </w:r>
     </w:p>
-    <w:p>
-      <w:pPr>
-        <w:pStyle w:val="Normal"/>
-        <w:ind w:hanging="0" w:start="708"/>
+    <w:p xmlns:wp14="http://schemas.microsoft.com/office/word/2010/wordml" wp14:textId="77777777">
+      <w:pPr>
+        <w:pStyle w:val="Normal"/>
+        <w:ind w:start="708" w:hanging="0"/>
         <w:jc w:val="start"/>
         <w:rPr/>
       </w:pPr>
@@ -1436,10 +1475,10 @@
         <w:t>Auf Produkte und Dienstleistungen aufmerksam machen</w:t>
       </w:r>
     </w:p>
-    <w:p>
-      <w:pPr>
-        <w:pStyle w:val="Normal"/>
-        <w:ind w:hanging="0" w:start="708"/>
+    <w:p xmlns:wp14="http://schemas.microsoft.com/office/word/2010/wordml" wp14:textId="77777777">
+      <w:pPr>
+        <w:pStyle w:val="Normal"/>
+        <w:ind w:start="708" w:hanging="0"/>
         <w:jc w:val="start"/>
         <w:rPr/>
       </w:pPr>
@@ -1448,10 +1487,10 @@
         <w:t>Unterbewusstsein von Menschen nutzen</w:t>
       </w:r>
     </w:p>
-    <w:p>
-      <w:pPr>
-        <w:pStyle w:val="Normal"/>
-        <w:ind w:hanging="0" w:start="708"/>
+    <w:p xmlns:wp14="http://schemas.microsoft.com/office/word/2010/wordml" wp14:textId="77777777">
+      <w:pPr>
+        <w:pStyle w:val="Normal"/>
+        <w:ind w:start="708" w:hanging="0"/>
         <w:jc w:val="start"/>
         <w:rPr/>
       </w:pPr>
@@ -1460,10 +1499,10 @@
         <w:t>Positive Assoziation mit Produkt</w:t>
       </w:r>
     </w:p>
-    <w:p>
-      <w:pPr>
-        <w:pStyle w:val="Normal"/>
-        <w:ind w:hanging="0" w:start="708"/>
+    <w:p xmlns:wp14="http://schemas.microsoft.com/office/word/2010/wordml" wp14:textId="77777777">
+      <w:pPr>
+        <w:pStyle w:val="Normal"/>
+        <w:ind w:start="708" w:hanging="0"/>
         <w:jc w:val="start"/>
         <w:rPr/>
       </w:pPr>
@@ -1472,10 +1511,10 @@
         <w:t>AIDA Formel: Attention, Interest, Desire, Action</w:t>
       </w:r>
     </w:p>
-    <w:p>
-      <w:pPr>
-        <w:pStyle w:val="Normal"/>
-        <w:ind w:hanging="0" w:start="0"/>
+    <w:p xmlns:wp14="http://schemas.microsoft.com/office/word/2010/wordml" wp14:textId="77777777">
+      <w:pPr>
+        <w:pStyle w:val="Normal"/>
+        <w:ind w:start="0" w:hanging="0"/>
         <w:jc w:val="start"/>
         <w:rPr/>
       </w:pPr>
@@ -1484,10 +1523,10 @@
         <w:t>Die Preise bei Märkten und Märkte:</w:t>
       </w:r>
     </w:p>
-    <w:p>
-      <w:pPr>
-        <w:pStyle w:val="Normal"/>
-        <w:ind w:hanging="0" w:start="708"/>
+    <w:p xmlns:wp14="http://schemas.microsoft.com/office/word/2010/wordml" wp14:textId="77777777">
+      <w:pPr>
+        <w:pStyle w:val="Normal"/>
+        <w:ind w:start="708" w:hanging="0"/>
         <w:jc w:val="start"/>
         <w:rPr/>
       </w:pPr>
@@ -1496,10 +1535,10 @@
         <w:t>Markt ist Treffpunkt von Angebot und Nachfrage (Gleichgewichtspreis) -&gt; Ebay oder Willhaben</w:t>
       </w:r>
     </w:p>
-    <w:p>
-      <w:pPr>
-        <w:pStyle w:val="Normal"/>
-        <w:ind w:hanging="0" w:start="708"/>
+    <w:p xmlns:wp14="http://schemas.microsoft.com/office/word/2010/wordml" wp14:textId="77777777">
+      <w:pPr>
+        <w:pStyle w:val="Normal"/>
+        <w:ind w:start="708" w:hanging="0"/>
         <w:jc w:val="start"/>
         <w:rPr/>
       </w:pPr>
@@ -1508,10 +1547,10 @@
         <w:t>Tausch von Gütern und Dienstleistungen wird heute mit dem Geldsystem abgewickelt -&gt; Arbeit (Erstellung von Gütern oder Dienstleistungen) -&gt; Geld -&gt; Kauf von Gütern und Dienstleistungen mit Geld</w:t>
       </w:r>
     </w:p>
-    <w:p>
-      <w:pPr>
-        <w:pStyle w:val="Normal"/>
-        <w:ind w:hanging="0" w:start="708"/>
+    <w:p xmlns:wp14="http://schemas.microsoft.com/office/word/2010/wordml" wp14:textId="77777777">
+      <w:pPr>
+        <w:pStyle w:val="Normal"/>
+        <w:ind w:start="708" w:hanging="0"/>
         <w:jc w:val="start"/>
         <w:rPr/>
       </w:pPr>
@@ -1520,10 +1559,10 @@
         <w:t>Preise sind abhängig von Angebot und Nachfrage</w:t>
       </w:r>
     </w:p>
-    <w:p>
-      <w:pPr>
-        <w:pStyle w:val="Normal"/>
-        <w:ind w:hanging="0" w:start="708"/>
+    <w:p xmlns:wp14="http://schemas.microsoft.com/office/word/2010/wordml" wp14:textId="77777777">
+      <w:pPr>
+        <w:pStyle w:val="Normal"/>
+        <w:ind w:start="708" w:hanging="0"/>
         <w:jc w:val="start"/>
         <w:rPr/>
       </w:pPr>
@@ -1532,10 +1571,10 @@
         <w:t>Sinkt Nachfrage -&gt; sinkt Preis</w:t>
       </w:r>
     </w:p>
-    <w:p>
-      <w:pPr>
-        <w:pStyle w:val="Normal"/>
-        <w:ind w:hanging="0" w:start="708"/>
+    <w:p xmlns:wp14="http://schemas.microsoft.com/office/word/2010/wordml" wp14:textId="77777777">
+      <w:pPr>
+        <w:pStyle w:val="Normal"/>
+        <w:ind w:start="708" w:hanging="0"/>
         <w:jc w:val="start"/>
         <w:rPr/>
       </w:pPr>
@@ -1544,10 +1583,10 @@
         <w:t>Steigt Nachfrage -&gt; steigt Preis</w:t>
       </w:r>
     </w:p>
-    <w:p>
-      <w:pPr>
-        <w:pStyle w:val="Normal"/>
-        <w:ind w:hanging="0" w:start="708"/>
+    <w:p xmlns:wp14="http://schemas.microsoft.com/office/word/2010/wordml" wp14:textId="77777777">
+      <w:pPr>
+        <w:pStyle w:val="Normal"/>
+        <w:ind w:start="708" w:hanging="0"/>
         <w:jc w:val="start"/>
         <w:rPr/>
       </w:pPr>
@@ -1556,10 +1595,10 @@
         <w:t>Preise von Wertpapieren und Rohstoffen usw. Sind nicht nur abhängig von Angebot und Nachfrage, sondern auch von Spekulation an der Börse</w:t>
       </w:r>
     </w:p>
-    <w:p>
-      <w:pPr>
-        <w:pStyle w:val="Normal"/>
-        <w:ind w:hanging="0" w:start="708"/>
+    <w:p xmlns:wp14="http://schemas.microsoft.com/office/word/2010/wordml" wp14:textId="77777777">
+      <w:pPr>
+        <w:pStyle w:val="Normal"/>
+        <w:ind w:start="708" w:hanging="0"/>
         <w:jc w:val="start"/>
         <w:rPr/>
       </w:pPr>
@@ -1568,10 +1607,10 @@
         <w:t>Kursentwicklung an Börsen von Indizes abgebildet:</w:t>
       </w:r>
     </w:p>
-    <w:p>
-      <w:pPr>
-        <w:pStyle w:val="Normal"/>
-        <w:ind w:hanging="0" w:start="708"/>
+    <w:p xmlns:wp14="http://schemas.microsoft.com/office/word/2010/wordml" wp14:textId="77777777">
+      <w:pPr>
+        <w:pStyle w:val="Normal"/>
+        <w:ind w:start="708" w:hanging="0"/>
         <w:jc w:val="start"/>
         <w:rPr/>
       </w:pPr>
@@ -1580,10 +1619,10 @@
         <w:t>Ö: ATX</w:t>
       </w:r>
     </w:p>
-    <w:p>
-      <w:pPr>
-        <w:pStyle w:val="Normal"/>
-        <w:ind w:hanging="0" w:start="708"/>
+    <w:p xmlns:wp14="http://schemas.microsoft.com/office/word/2010/wordml" wp14:textId="77777777">
+      <w:pPr>
+        <w:pStyle w:val="Normal"/>
+        <w:ind w:start="708" w:hanging="0"/>
         <w:jc w:val="start"/>
         <w:rPr/>
       </w:pPr>
@@ -1592,10 +1631,10 @@
         <w:t>D: DAX</w:t>
       </w:r>
     </w:p>
-    <w:p>
-      <w:pPr>
-        <w:pStyle w:val="Normal"/>
-        <w:ind w:hanging="0" w:start="708"/>
+    <w:p xmlns:wp14="http://schemas.microsoft.com/office/word/2010/wordml" wp14:textId="77777777">
+      <w:pPr>
+        <w:pStyle w:val="Normal"/>
+        <w:ind w:start="708" w:hanging="0"/>
         <w:jc w:val="start"/>
         <w:rPr/>
       </w:pPr>
@@ -1604,10 +1643,10 @@
         <w:t>USA: Dow Jones und Nasdaq 100</w:t>
       </w:r>
     </w:p>
-    <w:p>
-      <w:pPr>
-        <w:pStyle w:val="Normal"/>
-        <w:ind w:hanging="0" w:start="708"/>
+    <w:p xmlns:wp14="http://schemas.microsoft.com/office/word/2010/wordml" wp14:textId="77777777">
+      <w:pPr>
+        <w:pStyle w:val="Normal"/>
+        <w:ind w:start="708" w:hanging="0"/>
         <w:jc w:val="start"/>
         <w:rPr/>
       </w:pPr>
@@ -1616,10 +1655,10 @@
         <w:t>China: Hang Seng</w:t>
       </w:r>
     </w:p>
-    <w:p>
-      <w:pPr>
-        <w:pStyle w:val="Normal"/>
-        <w:ind w:hanging="0" w:start="708"/>
+    <w:p xmlns:wp14="http://schemas.microsoft.com/office/word/2010/wordml" wp14:textId="77777777">
+      <w:pPr>
+        <w:pStyle w:val="Normal"/>
+        <w:ind w:start="708" w:hanging="0"/>
         <w:jc w:val="start"/>
         <w:rPr/>
       </w:pPr>
@@ -1628,10 +1667,10 @@
         <w:t>Japan: Nikkei 225</w:t>
       </w:r>
     </w:p>
-    <w:p>
-      <w:pPr>
-        <w:pStyle w:val="Normal"/>
-        <w:ind w:hanging="0" w:start="708"/>
+    <w:p xmlns:wp14="http://schemas.microsoft.com/office/word/2010/wordml" wp14:textId="77777777">
+      <w:pPr>
+        <w:pStyle w:val="Normal"/>
+        <w:ind w:start="708" w:hanging="0"/>
         <w:jc w:val="start"/>
         <w:rPr/>
       </w:pPr>
@@ -1640,10 +1679,10 @@
         <w:t>MSCI World</w:t>
       </w:r>
     </w:p>
-    <w:p>
-      <w:pPr>
-        <w:pStyle w:val="Normal"/>
-        <w:ind w:hanging="0" w:start="0"/>
+    <w:p xmlns:wp14="http://schemas.microsoft.com/office/word/2010/wordml" wp14:textId="77777777">
+      <w:pPr>
+        <w:pStyle w:val="Normal"/>
+        <w:ind w:start="0" w:hanging="0"/>
         <w:jc w:val="start"/>
         <w:rPr/>
       </w:pPr>
@@ -1652,49 +1691,94 @@
         <w:t>Marktformen</w:t>
       </w:r>
     </w:p>
-    <w:p>
-      <w:pPr>
-        <w:pStyle w:val="Normal"/>
-        <w:ind w:firstLine="708" w:start="1416"/>
+    <w:p xmlns:wp14="http://schemas.microsoft.com/office/word/2010/wordml" wp14:textId="77777777">
+      <w:pPr>
+        <w:pStyle w:val="Normal"/>
+        <w:ind w:start="1416" w:firstLine="708"/>
         <w:jc w:val="start"/>
         <w:rPr/>
       </w:pPr>
       <w:r>
         <w:rPr/>
         <w:t>Viele Anbieter</w:t>
-        <w:tab/>
+      </w:r>
+      <w:r>
+        <w:rPr/>
+        <w:tab/>
+      </w:r>
+      <w:r>
+        <w:rPr/>
         <w:t>Weniger Anbieter</w:t>
-        <w:tab/>
-        <w:tab/>
+      </w:r>
+      <w:r>
+        <w:rPr/>
+        <w:tab/>
+      </w:r>
+      <w:r>
+        <w:rPr/>
+        <w:tab/>
+      </w:r>
+      <w:r>
+        <w:rPr/>
         <w:t>Ein Anbieter</w:t>
-        <w:tab/>
-      </w:r>
-    </w:p>
-    <w:p>
-      <w:pPr>
-        <w:pStyle w:val="Normal"/>
-        <w:ind w:hanging="0" w:start="0"/>
+      </w:r>
+      <w:r>
+        <w:rPr/>
+        <w:tab/>
+      </w:r>
+    </w:p>
+    <w:p xmlns:wp14="http://schemas.microsoft.com/office/word/2010/wordml" wp14:textId="77777777">
+      <w:pPr>
+        <w:pStyle w:val="Normal"/>
+        <w:ind w:start="0" w:hanging="0"/>
         <w:jc w:val="start"/>
         <w:rPr/>
       </w:pPr>
       <w:r>
         <w:rPr/>
         <w:t>Viele Nachfrager</w:t>
-        <w:tab/>
+      </w:r>
+      <w:r>
+        <w:rPr/>
+        <w:tab/>
+      </w:r>
+      <w:r>
+        <w:rPr/>
         <w:t>Polypol</w:t>
-        <w:tab/>
-        <w:tab/>
+      </w:r>
+      <w:r>
+        <w:rPr/>
+        <w:tab/>
+      </w:r>
+      <w:r>
+        <w:rPr/>
+        <w:tab/>
+      </w:r>
+      <w:r>
+        <w:rPr/>
         <w:t>Oligopol</w:t>
-        <w:tab/>
-        <w:tab/>
-        <w:tab/>
+      </w:r>
+      <w:r>
+        <w:rPr/>
+        <w:tab/>
+      </w:r>
+      <w:r>
+        <w:rPr/>
+        <w:tab/>
+      </w:r>
+      <w:r>
+        <w:rPr/>
+        <w:tab/>
+      </w:r>
+      <w:r>
+        <w:rPr/>
         <w:t>Monopol</w:t>
       </w:r>
     </w:p>
-    <w:p>
-      <w:pPr>
-        <w:pStyle w:val="Normal"/>
-        <w:ind w:firstLine="708" w:start="0"/>
+    <w:p xmlns:wp14="http://schemas.microsoft.com/office/word/2010/wordml" wp14:textId="77777777">
+      <w:pPr>
+        <w:pStyle w:val="Normal"/>
+        <w:ind w:start="0" w:firstLine="708"/>
         <w:jc w:val="start"/>
         <w:rPr/>
       </w:pPr>
@@ -1703,10 +1787,10 @@
         <w:t>Oligopole nehmen zu</w:t>
       </w:r>
     </w:p>
-    <w:p>
-      <w:pPr>
-        <w:pStyle w:val="Normal"/>
-        <w:ind w:firstLine="708" w:start="0"/>
+    <w:p xmlns:wp14="http://schemas.microsoft.com/office/word/2010/wordml" wp14:textId="77777777">
+      <w:pPr>
+        <w:pStyle w:val="Normal"/>
+        <w:ind w:start="0" w:firstLine="708"/>
         <w:jc w:val="start"/>
         <w:rPr/>
       </w:pPr>
@@ -1715,24 +1799,30 @@
         <w:t>Meta kaufte Whatsapp</w:t>
       </w:r>
     </w:p>
-    <w:p>
-      <w:pPr>
-        <w:pStyle w:val="Normal"/>
-        <w:ind w:hanging="0" w:start="0"/>
+    <w:p xmlns:wp14="http://schemas.microsoft.com/office/word/2010/wordml" wp14:textId="77777777">
+      <w:pPr>
+        <w:pStyle w:val="Normal"/>
+        <w:ind w:start="0" w:hanging="0"/>
         <w:jc w:val="start"/>
         <w:rPr/>
       </w:pPr>
       <w:r>
         <w:rPr/>
         <w:t xml:space="preserve">Unterschiedliche Marken im Supermarkt täuschen viele Anbieter vor -&gt; oft nur </w:t>
-        <w:tab/>
+      </w:r>
+      <w:r>
+        <w:rPr/>
+        <w:tab/>
+      </w:r>
+      <w:r>
+        <w:rPr/>
         <w:t>ein Unternehmen</w:t>
       </w:r>
     </w:p>
-    <w:p>
-      <w:pPr>
-        <w:pStyle w:val="Normal"/>
-        <w:ind w:hanging="0" w:start="0"/>
+    <w:p xmlns:wp14="http://schemas.microsoft.com/office/word/2010/wordml" wp14:textId="77777777">
+      <w:pPr>
+        <w:pStyle w:val="Normal"/>
+        <w:ind w:start="0" w:hanging="0"/>
         <w:jc w:val="center"/>
         <w:rPr/>
       </w:pPr>
@@ -1740,10 +1830,10 @@
         <w:rPr/>
       </w:r>
     </w:p>
-    <w:p>
-      <w:pPr>
-        <w:pStyle w:val="Normal"/>
-        <w:ind w:firstLine="708" w:start="0"/>
+    <w:p xmlns:wp14="http://schemas.microsoft.com/office/word/2010/wordml" wp14:textId="77777777">
+      <w:pPr>
+        <w:pStyle w:val="Normal"/>
+        <w:ind w:start="0" w:firstLine="708"/>
         <w:jc w:val="start"/>
         <w:rPr>
           <w:i/>
@@ -1756,481 +1846,936 @@
         <w:t>AnbieterInnen können Kartelle bilden (sind jedoch verboten):</w:t>
       </w:r>
     </w:p>
+    <w:p xmlns:wp14="http://schemas.microsoft.com/office/word/2010/wordml" wp14:textId="77777777">
+      <w:pPr>
+        <w:pStyle w:val="Normal"/>
+        <w:ind w:start="0" w:firstLine="708"/>
+        <w:jc w:val="start"/>
+        <w:rPr/>
+      </w:pPr>
+      <w:r>
+        <w:rPr/>
+        <w:t>Preiskartell: Preis wird bestimmt</w:t>
+      </w:r>
+    </w:p>
+    <w:p xmlns:wp14="http://schemas.microsoft.com/office/word/2010/wordml" wp14:textId="77777777">
+      <w:pPr>
+        <w:pStyle w:val="Normal"/>
+        <w:ind w:start="0" w:firstLine="708"/>
+        <w:jc w:val="start"/>
+        <w:rPr/>
+      </w:pPr>
+      <w:r>
+        <w:rPr/>
+        <w:t>Mengenkartell: produzierte Menge wird bestimmt</w:t>
+      </w:r>
+    </w:p>
+    <w:p xmlns:wp14="http://schemas.microsoft.com/office/word/2010/wordml" wp14:textId="77777777">
+      <w:pPr>
+        <w:pStyle w:val="Normal"/>
+        <w:ind w:start="0" w:firstLine="708"/>
+        <w:jc w:val="start"/>
+        <w:rPr/>
+      </w:pPr>
+      <w:r>
+        <w:rPr/>
+        <w:t>Gebietskartell: Gebiete werden aufgeteilt</w:t>
+      </w:r>
+    </w:p>
+    <w:p xmlns:wp14="http://schemas.microsoft.com/office/word/2010/wordml" wp14:textId="77777777">
+      <w:pPr>
+        <w:pStyle w:val="Normal"/>
+        <w:ind w:start="0" w:firstLine="708"/>
+        <w:jc w:val="start"/>
+        <w:rPr/>
+      </w:pPr>
+      <w:r>
+        <w:rPr/>
+        <w:t xml:space="preserve">Bekanntes Kartell (jedoch nicht verboten) -&gt; OPEC (Organisation </w:t>
+      </w:r>
+    </w:p>
+    <w:p xmlns:wp14="http://schemas.microsoft.com/office/word/2010/wordml" wp14:textId="77777777">
+      <w:pPr>
+        <w:pStyle w:val="Normal"/>
+        <w:ind w:start="0" w:firstLine="708"/>
+        <w:jc w:val="start"/>
+        <w:rPr/>
+      </w:pPr>
+      <w:r>
+        <w:rPr/>
+        <w:t>Erdölexportierender Länder) -&gt; Hauptsitz Wien</w:t>
+      </w:r>
+    </w:p>
+    <w:p xmlns:wp14="http://schemas.microsoft.com/office/word/2010/wordml" wp14:textId="77777777">
+      <w:pPr>
+        <w:pStyle w:val="Normal"/>
+        <w:ind w:start="0" w:firstLine="708"/>
+        <w:jc w:val="start"/>
+        <w:rPr/>
+      </w:pPr>
+      <w:r>
+        <w:rPr/>
+      </w:r>
+    </w:p>
+    <w:p xmlns:wp14="http://schemas.microsoft.com/office/word/2010/wordml" wp14:textId="77777777">
+      <w:pPr>
+        <w:pStyle w:val="Normal"/>
+        <w:ind w:start="0" w:firstLine="708"/>
+        <w:jc w:val="start"/>
+        <w:rPr/>
+      </w:pPr>
+      <w:r>
+        <w:rPr/>
+        <w:t xml:space="preserve">Das Wettbewerbsmodell geht von der Annahme aus, dass der rational </w:t>
+      </w:r>
+    </w:p>
+    <w:p xmlns:wp14="http://schemas.microsoft.com/office/word/2010/wordml" wp14:textId="77777777">
+      <w:pPr>
+        <w:pStyle w:val="Normal"/>
+        <w:ind w:start="0" w:firstLine="708"/>
+        <w:jc w:val="start"/>
+        <w:rPr/>
+      </w:pPr>
+      <w:r>
+        <w:rPr/>
+        <w:t xml:space="preserve">handelnde Mensch alle seine Entscheidungen mit dem Ziel trifft, seinen Gewinn </w:t>
+      </w:r>
+      <w:r>
+        <w:rPr/>
+        <w:tab/>
+      </w:r>
+      <w:r>
+        <w:rPr/>
+        <w:t>zu maximieren -&gt; Homo oeconomicus</w:t>
+      </w:r>
+    </w:p>
+    <w:p xmlns:wp14="http://schemas.microsoft.com/office/word/2010/wordml" wp14:textId="77777777">
+      <w:pPr>
+        <w:pStyle w:val="Normal"/>
+        <w:ind w:start="0" w:firstLine="708"/>
+        <w:jc w:val="start"/>
+        <w:rPr/>
+      </w:pPr>
+      <w:r>
+        <w:rPr/>
+        <w:t xml:space="preserve">Kann ein Unternehmen nicht bei den Preisen nicht mithalten, scheidet es aus </w:t>
+      </w:r>
+      <w:r>
+        <w:rPr/>
+        <w:tab/>
+      </w:r>
+      <w:r>
+        <w:rPr/>
+        <w:t>dem Markt aus</w:t>
+      </w:r>
+    </w:p>
+    <w:p xmlns:wp14="http://schemas.microsoft.com/office/word/2010/wordml" wp14:textId="77777777">
+      <w:pPr>
+        <w:pStyle w:val="Normal"/>
+        <w:ind w:start="0" w:firstLine="708"/>
+        <w:jc w:val="start"/>
+        <w:rPr/>
+      </w:pPr>
+      <w:r>
+        <w:rPr/>
+        <w:t xml:space="preserve">Innovationen treiben die Märkte durch Neuerungen an (z.B. Internet, bessere </w:t>
+      </w:r>
+      <w:r>
+        <w:rPr/>
+        <w:tab/>
+      </w:r>
+      <w:r>
+        <w:rPr/>
+        <w:t>Grafikkarten usw.)</w:t>
+      </w:r>
+    </w:p>
+    <w:p xmlns:wp14="http://schemas.microsoft.com/office/word/2010/wordml" wp14:textId="77777777">
+      <w:pPr>
+        <w:pStyle w:val="Normal"/>
+        <w:ind w:start="0" w:hanging="0"/>
+        <w:jc w:val="start"/>
+        <w:rPr/>
+      </w:pPr>
+      <w:r>
+        <w:rPr/>
+        <w:t>2.5 Produktionsfaktoren</w:t>
+      </w:r>
+    </w:p>
+    <w:p xmlns:wp14="http://schemas.microsoft.com/office/word/2010/wordml" wp14:textId="77777777">
+      <w:pPr>
+        <w:pStyle w:val="Normal"/>
+        <w:ind w:start="0" w:hanging="0"/>
+        <w:jc w:val="start"/>
+        <w:rPr/>
+      </w:pPr>
+      <w:r>
+        <w:rPr/>
+        <w:t>Produktionsfaktoren:</w:t>
+      </w:r>
+    </w:p>
+    <w:p xmlns:wp14="http://schemas.microsoft.com/office/word/2010/wordml" wp14:textId="77777777">
+      <w:pPr>
+        <w:pStyle w:val="Normal"/>
+        <w:spacing w:before="0" w:after="0" w:afterAutospacing="0"/>
+        <w:ind w:start="0" w:hanging="0"/>
+        <w:jc w:val="start"/>
+        <w:rPr/>
+      </w:pPr>
+      <w:r>
+        <w:rPr/>
+        <w:t>Grund und Boden (Anbauboden, Abbauboden, Immobilien)</w:t>
+      </w:r>
+    </w:p>
+    <w:p xmlns:wp14="http://schemas.microsoft.com/office/word/2010/wordml" wp14:textId="77777777">
+      <w:pPr>
+        <w:pStyle w:val="Normal"/>
+        <w:spacing w:before="0" w:after="0" w:afterAutospacing="0"/>
+        <w:ind w:start="0" w:hanging="0"/>
+        <w:jc w:val="start"/>
+        <w:rPr/>
+      </w:pPr>
+      <w:r>
+        <w:rPr/>
+        <w:t>Arbeitskraft (S.87)</w:t>
+      </w:r>
+    </w:p>
+    <w:p xmlns:wp14="http://schemas.microsoft.com/office/word/2010/wordml" wp14:textId="77777777">
+      <w:pPr>
+        <w:pStyle w:val="Normal"/>
+        <w:spacing w:before="0" w:after="0" w:afterAutospacing="0"/>
+        <w:ind w:start="0" w:hanging="0"/>
+        <w:jc w:val="start"/>
+        <w:rPr/>
+      </w:pPr>
+      <w:r>
+        <w:rPr/>
+        <w:t>Kapital (Geld oder Human-, Sach-, Anlagekapital)</w:t>
+      </w:r>
+    </w:p>
+    <w:p xmlns:wp14="http://schemas.microsoft.com/office/word/2010/wordml" wp14:textId="20A94D83">
+      <w:pPr>
+        <w:pStyle w:val="Normal"/>
+        <w:spacing w:before="0" w:after="0" w:afterAutospacing="off"/>
+        <w:ind w:start="0" w:hanging="0"/>
+      </w:pPr>
+      <w:r>
+        <w:rPr/>
+        <w:t>Humankapital (Wissen und Bildung) wird immer wichtiger</w:t>
+      </w:r>
+    </w:p>
+    <w:p xmlns:wp14="http://schemas.microsoft.com/office/word/2010/wordml" wp14:textId="77777777">
+      <w:pPr>
+        <w:pStyle w:val="Normal"/>
+        <w:ind w:start="0" w:hanging="0"/>
+        <w:jc w:val="start"/>
+        <w:rPr/>
+      </w:pPr>
+      <w:r>
+        <w:rPr/>
+        <w:t>Stand</w:t>
+      </w:r>
+      <w:r>
+        <w:rPr/>
+        <w:t>a</w:t>
+      </w:r>
+      <w:r>
+        <w:rPr/>
+        <w:t>rdfaktoren bestimmen Ortswahl für ein Unternehmen</w:t>
+      </w:r>
+    </w:p>
+    <w:p xmlns:wp14="http://schemas.microsoft.com/office/word/2010/wordml" wp14:textId="77777777">
+      <w:pPr>
+        <w:pStyle w:val="Normal"/>
+        <w:spacing w:before="0" w:after="0" w:afterAutospacing="0"/>
+        <w:ind w:start="0" w:hanging="0"/>
+        <w:jc w:val="start"/>
+        <w:rPr/>
+      </w:pPr>
+      <w:r>
+        <w:rPr/>
+        <w:t>Rohstoffe</w:t>
+      </w:r>
+    </w:p>
+    <w:p xmlns:wp14="http://schemas.microsoft.com/office/word/2010/wordml" wp14:textId="77777777">
+      <w:pPr>
+        <w:pStyle w:val="Normal"/>
+        <w:spacing w:before="0" w:after="0" w:afterAutospacing="0"/>
+        <w:ind w:start="0" w:hanging="0"/>
+        <w:jc w:val="start"/>
+        <w:rPr/>
+      </w:pPr>
+      <w:r>
+        <w:rPr/>
+        <w:t>Arbeitskräfte</w:t>
+      </w:r>
+    </w:p>
+    <w:p xmlns:wp14="http://schemas.microsoft.com/office/word/2010/wordml" wp14:textId="77777777">
+      <w:pPr>
+        <w:pStyle w:val="Normal"/>
+        <w:spacing w:before="0" w:after="0" w:afterAutospacing="0"/>
+        <w:ind w:start="0" w:hanging="0"/>
+        <w:jc w:val="start"/>
+        <w:rPr/>
+      </w:pPr>
+      <w:r>
+        <w:rPr/>
+        <w:t>Absatzmarkt</w:t>
+      </w:r>
+    </w:p>
+    <w:p xmlns:wp14="http://schemas.microsoft.com/office/word/2010/wordml" wp14:textId="77777777">
+      <w:pPr>
+        <w:pStyle w:val="Normal"/>
+        <w:spacing w:before="0" w:after="0" w:afterAutospacing="0"/>
+        <w:ind w:start="0" w:hanging="0"/>
+        <w:jc w:val="start"/>
+        <w:rPr/>
+      </w:pPr>
+      <w:r>
+        <w:rPr/>
+        <w:t>Umweltschutzbestimmungen</w:t>
+      </w:r>
+    </w:p>
+    <w:p xmlns:wp14="http://schemas.microsoft.com/office/word/2010/wordml" wp14:textId="77777777">
+      <w:pPr>
+        <w:pStyle w:val="Normal"/>
+        <w:spacing w:before="0" w:after="0" w:afterAutospacing="0"/>
+        <w:ind w:start="0" w:hanging="0"/>
+        <w:jc w:val="start"/>
+        <w:rPr/>
+      </w:pPr>
+      <w:r>
+        <w:rPr/>
+        <w:t>Infrastruktur</w:t>
+      </w:r>
+    </w:p>
+    <w:p xmlns:wp14="http://schemas.microsoft.com/office/word/2010/wordml" wp14:textId="77777777">
+      <w:pPr>
+        <w:pStyle w:val="Normal"/>
+        <w:spacing w:before="0" w:after="0" w:afterAutospacing="0"/>
+        <w:ind w:start="0" w:hanging="0"/>
+        <w:jc w:val="start"/>
+        <w:rPr/>
+      </w:pPr>
+      <w:r>
+        <w:rPr/>
+        <w:t>Steuern</w:t>
+      </w:r>
+    </w:p>
+    <w:p xmlns:wp14="http://schemas.microsoft.com/office/word/2010/wordml" wp14:textId="77777777">
+      <w:pPr>
+        <w:pStyle w:val="Normal"/>
+        <w:spacing w:before="0" w:after="0" w:afterAutospacing="0"/>
+        <w:ind w:start="0" w:hanging="0"/>
+        <w:jc w:val="start"/>
+        <w:rPr/>
+      </w:pPr>
+      <w:r>
+        <w:rPr/>
+        <w:t>Subventionen</w:t>
+      </w:r>
+    </w:p>
+    <w:p xmlns:wp14="http://schemas.microsoft.com/office/word/2010/wordml" wp14:textId="77777777">
+      <w:pPr>
+        <w:pStyle w:val="Normal"/>
+        <w:spacing w:before="0" w:after="160" w:afterAutospacing="0"/>
+        <w:ind w:start="0" w:hanging="0"/>
+        <w:jc w:val="start"/>
+        <w:rPr/>
+      </w:pPr>
+      <w:r>
+        <w:rPr/>
+        <w:t>2.6 Geld – Inflation (Inflationsrechner)</w:t>
+      </w:r>
+    </w:p>
+    <w:p xmlns:wp14="http://schemas.microsoft.com/office/word/2010/wordml" wp14:textId="77777777">
+      <w:pPr>
+        <w:pStyle w:val="Normal"/>
+        <w:spacing w:before="0" w:after="160" w:afterAutospacing="0"/>
+        <w:ind w:start="0" w:hanging="0"/>
+        <w:jc w:val="start"/>
+        <w:rPr/>
+      </w:pPr>
+      <w:r>
+        <w:rPr/>
+        <w:t>Funktion des Geldes</w:t>
+      </w:r>
+    </w:p>
+    <w:p xmlns:wp14="http://schemas.microsoft.com/office/word/2010/wordml" wp14:textId="77777777">
+      <w:pPr>
+        <w:pStyle w:val="Normal"/>
+        <w:spacing w:before="0" w:after="0" w:afterAutospacing="0"/>
+        <w:ind w:start="0" w:hanging="0"/>
+        <w:jc w:val="start"/>
+        <w:rPr/>
+      </w:pPr>
+      <w:r>
+        <w:rPr/>
+        <w:t>Geld ist ein/e</w:t>
+      </w:r>
+      <w:r>
+        <w:rPr/>
+        <w:tab/>
+      </w:r>
+      <w:r>
+        <w:rPr/>
+        <w:tab/>
+      </w:r>
+      <w:r>
+        <w:rPr/>
+        <w:tab/>
+      </w:r>
+      <w:r>
+        <w:rPr/>
+        <w:tab/>
+      </w:r>
+      <w:r>
+        <w:rPr/>
+        <w:t>Schlüsselwörter</w:t>
+      </w:r>
+    </w:p>
+    <w:p xmlns:wp14="http://schemas.microsoft.com/office/word/2010/wordml" wp14:textId="77777777">
+      <w:pPr>
+        <w:pStyle w:val="Normal"/>
+        <w:spacing w:before="0" w:after="0" w:afterAutospacing="0"/>
+        <w:ind w:start="0" w:hanging="0"/>
+        <w:jc w:val="start"/>
+        <w:rPr/>
+      </w:pPr>
+      <w:r>
+        <w:rPr/>
+        <w:t>Zahlungsmittel</w:t>
+      </w:r>
+      <w:r>
+        <w:rPr/>
+        <w:tab/>
+      </w:r>
+      <w:r>
+        <w:rPr/>
+        <w:tab/>
+      </w:r>
+      <w:r>
+        <w:rPr/>
+        <w:tab/>
+      </w:r>
+      <w:r>
+        <w:rPr/>
+        <w:t>kaufen, bezahlen</w:t>
+      </w:r>
+    </w:p>
+    <w:p xmlns:wp14="http://schemas.microsoft.com/office/word/2010/wordml" wp14:textId="77777777">
+      <w:pPr>
+        <w:pStyle w:val="Normal"/>
+        <w:spacing w:before="0" w:after="0" w:afterAutospacing="0"/>
+        <w:ind w:start="0" w:hanging="0"/>
+        <w:jc w:val="start"/>
+        <w:rPr/>
+      </w:pPr>
+      <w:r>
+        <w:rPr/>
+        <w:t>Aufbewahrungsmittel</w:t>
+      </w:r>
+      <w:r>
+        <w:rPr/>
+        <w:tab/>
+      </w:r>
+      <w:r>
+        <w:rPr/>
+        <w:tab/>
+      </w:r>
+      <w:r>
+        <w:rPr/>
+        <w:t>aufheben, sparen</w:t>
+      </w:r>
+    </w:p>
+    <w:p xmlns:wp14="http://schemas.microsoft.com/office/word/2010/wordml" wp14:textId="77777777">
+      <w:pPr>
+        <w:pStyle w:val="Normal"/>
+        <w:spacing w:before="0" w:after="0" w:afterAutospacing="0"/>
+        <w:ind w:start="0" w:hanging="0"/>
+        <w:jc w:val="start"/>
+        <w:rPr/>
+      </w:pPr>
+      <w:r>
+        <w:rPr/>
+        <w:t>Recheneinheit</w:t>
+      </w:r>
+      <w:r>
+        <w:rPr/>
+        <w:tab/>
+      </w:r>
+      <w:r>
+        <w:rPr/>
+        <w:tab/>
+      </w:r>
+      <w:r>
+        <w:rPr/>
+        <w:tab/>
+      </w:r>
+      <w:r>
+        <w:rPr/>
+        <w:t>ausrechnen, vergleichen, günstig</w:t>
+      </w:r>
+    </w:p>
+    <w:p xmlns:wp14="http://schemas.microsoft.com/office/word/2010/wordml" wp14:textId="77777777">
+      <w:pPr>
+        <w:pStyle w:val="Normal"/>
+        <w:spacing w:before="0" w:after="80" w:afterAutospacing="0"/>
+        <w:ind w:start="0" w:hanging="0"/>
+        <w:jc w:val="start"/>
+        <w:rPr/>
+      </w:pPr>
+      <w:r>
+        <w:rPr/>
+        <w:t>Geld hat keinen intrinsischen (anders als z.B.: Gold) Wert</w:t>
+      </w:r>
+    </w:p>
+    <w:p xmlns:wp14="http://schemas.microsoft.com/office/word/2010/wordml" wp14:textId="77777777">
+      <w:pPr>
+        <w:pStyle w:val="Normal"/>
+        <w:spacing w:before="0" w:after="80" w:afterAutospacing="0"/>
+        <w:ind w:start="0" w:hanging="0"/>
+        <w:jc w:val="start"/>
+        <w:rPr/>
+      </w:pPr>
+      <w:r>
+        <w:rPr/>
+        <w:t>Früher waren Währung teilweise mit Gold gedeckt -&gt; problematisch</w:t>
+      </w:r>
+    </w:p>
+    <w:p xmlns:wp14="http://schemas.microsoft.com/office/word/2010/wordml" wp14:textId="77777777">
+      <w:pPr>
+        <w:pStyle w:val="Normal"/>
+        <w:spacing w:before="0" w:after="80" w:afterAutospacing="0"/>
+        <w:ind w:start="0" w:hanging="0"/>
+        <w:jc w:val="start"/>
+        <w:rPr/>
+      </w:pPr>
+      <w:r>
+        <w:rPr/>
+        <w:t>Geld ist eine Schuldverschreibung der Zentralbank</w:t>
+      </w:r>
+    </w:p>
+    <w:p xmlns:wp14="http://schemas.microsoft.com/office/word/2010/wordml" wp14:textId="77777777">
+      <w:pPr>
+        <w:pStyle w:val="Normal"/>
+        <w:spacing w:before="0" w:after="80" w:afterAutospacing="0"/>
+        <w:ind w:start="0" w:hanging="0"/>
+        <w:jc w:val="start"/>
+        <w:rPr/>
+      </w:pPr>
+      <w:r>
+        <w:rPr/>
+        <w:t xml:space="preserve">Früher war Gold das Zahlungsmittele -&gt; König hatte nicht genug Gold, um </w:t>
+      </w:r>
+      <w:r>
+        <w:rPr/>
+        <w:tab/>
+      </w:r>
+      <w:r>
+        <w:rPr/>
+        <w:tab/>
+      </w:r>
+      <w:r>
+        <w:rPr/>
+        <w:t xml:space="preserve">Menschen zu bezahlen -&gt; hat Gold mit anderen Materialien gemischt -&gt; Mehr </w:t>
+      </w:r>
+      <w:r>
+        <w:rPr/>
+        <w:tab/>
+      </w:r>
+      <w:r>
+        <w:rPr/>
+        <w:t>“Gold” -&gt; Inflation</w:t>
+      </w:r>
+    </w:p>
+    <w:p xmlns:wp14="http://schemas.microsoft.com/office/word/2010/wordml" wp14:textId="77777777">
+      <w:pPr>
+        <w:pStyle w:val="Normal"/>
+        <w:spacing w:before="0" w:after="80" w:afterAutospacing="0"/>
+        <w:ind w:start="0" w:hanging="0"/>
+        <w:jc w:val="start"/>
+        <w:rPr/>
+      </w:pPr>
+      <w:r>
+        <w:rPr/>
+        <w:t>Löhne werden jedes Jahr an die Inflation angepasst und somit erhöht</w:t>
+      </w:r>
+    </w:p>
     <w:p>
       <w:pPr>
         <w:pStyle w:val="Normal"/>
-        <w:ind w:firstLine="708" w:start="0"/>
-        <w:jc w:val="start"/>
-        <w:rPr/>
-      </w:pPr>
-      <w:r>
-        <w:rPr/>
-        <w:t>Preiskartell: Preis wird bestimmt</w:t>
+        <w:spacing w:before="0" w:after="80" w:afterAutospacing="off"/>
+        <w:ind w:hanging="0"/>
+      </w:pPr>
+      <w:r>
+        <w:rPr/>
+        <w:t>2.7 - Deflation ist gefährlicher</w:t>
       </w:r>
     </w:p>
     <w:p>
       <w:pPr>
         <w:pStyle w:val="Normal"/>
-        <w:ind w:firstLine="708" w:start="0"/>
-        <w:jc w:val="start"/>
-        <w:rPr/>
-      </w:pPr>
-      <w:r>
-        <w:rPr/>
-        <w:t>Mengenkartell: produzierte Menge wird bestimmt</w:t>
+        <w:spacing w:before="0" w:after="80" w:afterAutospacing="off"/>
+        <w:ind w:hanging="0"/>
+      </w:pPr>
+      <w:r>
+        <w:rPr/>
+        <w:t>Bei Deflation fallen die Preise</w:t>
       </w:r>
     </w:p>
     <w:p>
       <w:pPr>
         <w:pStyle w:val="Normal"/>
-        <w:ind w:firstLine="708" w:start="0"/>
-        <w:jc w:val="start"/>
-        <w:rPr/>
-      </w:pPr>
-      <w:r>
-        <w:rPr/>
-        <w:t>Gebietskartell: Gebiete werden aufgeteilt</w:t>
+        <w:spacing w:before="0" w:after="80" w:afterAutospacing="off"/>
+        <w:ind w:hanging="0"/>
+      </w:pPr>
+      <w:r>
+        <w:rPr/>
+        <w:t xml:space="preserve">Was ist die </w:t>
+      </w:r>
+      <w:r>
+        <w:rPr/>
+        <w:t>Folge</w:t>
       </w:r>
     </w:p>
     <w:p>
       <w:pPr>
         <w:pStyle w:val="Normal"/>
-        <w:ind w:firstLine="708" w:start="0"/>
-        <w:jc w:val="start"/>
-        <w:rPr/>
-      </w:pPr>
-      <w:r>
-        <w:rPr/>
-        <w:t xml:space="preserve">Bekanntes Kartell (jedoch nicht verboten) -&gt; OPEC (Organisation </w:t>
+        <w:spacing w:before="0" w:after="80" w:afterAutospacing="off"/>
+        <w:ind w:hanging="0"/>
+      </w:pPr>
+      <w:r>
+        <w:rPr/>
+        <w:t>Unternehmen und Privatpersonen zögern Konsum und Investition, weil sie annehmen Preise noch weiter fallen -&gt; Nachfrage sinkt -&gt; Arbeitsplätze werden abgebaut -</w:t>
+      </w:r>
+      <w:r>
+        <w:rPr/>
+        <w:t>&gt;</w:t>
+      </w:r>
+      <w:r>
+        <w:rPr/>
+        <w:t xml:space="preserve"> </w:t>
+      </w:r>
+      <w:r>
+        <w:rPr/>
+        <w:t>L</w:t>
+      </w:r>
+      <w:r>
+        <w:rPr/>
+        <w:t>ö</w:t>
+      </w:r>
+      <w:r>
+        <w:rPr/>
+        <w:t>h</w:t>
+      </w:r>
+      <w:r>
+        <w:rPr/>
+        <w:t>n</w:t>
+      </w:r>
+      <w:r>
+        <w:rPr/>
+        <w:t>e</w:t>
+      </w:r>
+      <w:r>
+        <w:rPr/>
+        <w:t xml:space="preserve"> </w:t>
+      </w:r>
+      <w:r>
+        <w:rPr/>
+        <w:t>s</w:t>
+      </w:r>
+      <w:r>
+        <w:rPr/>
+        <w:t>i</w:t>
+      </w:r>
+      <w:r>
+        <w:rPr/>
+        <w:t>n</w:t>
+      </w:r>
+      <w:r>
+        <w:rPr/>
+        <w:t>k</w:t>
+      </w:r>
+      <w:r>
+        <w:rPr/>
+        <w:t>e</w:t>
+      </w:r>
+      <w:r>
+        <w:rPr/>
+        <w:t>n</w:t>
+      </w:r>
+      <w:r>
+        <w:rPr/>
+        <w:t xml:space="preserve"> </w:t>
+      </w:r>
+      <w:r>
+        <w:rPr/>
+        <w:t>-</w:t>
+      </w:r>
+      <w:r>
+        <w:rPr/>
+        <w:t>&gt;</w:t>
+      </w:r>
+      <w:r>
+        <w:rPr/>
+        <w:t xml:space="preserve"> </w:t>
+      </w:r>
+      <w:r>
+        <w:rPr/>
+        <w:t>N</w:t>
+      </w:r>
+      <w:r>
+        <w:rPr/>
+        <w:t>a</w:t>
+      </w:r>
+      <w:r>
+        <w:rPr/>
+        <w:t>c</w:t>
+      </w:r>
+      <w:r>
+        <w:rPr/>
+        <w:t>h</w:t>
+      </w:r>
+      <w:r>
+        <w:rPr/>
+        <w:t>f</w:t>
+      </w:r>
+      <w:r>
+        <w:rPr/>
+        <w:t>r</w:t>
+      </w:r>
+      <w:r>
+        <w:rPr/>
+        <w:t>a</w:t>
+      </w:r>
+      <w:r>
+        <w:rPr/>
+        <w:t>g</w:t>
+      </w:r>
+      <w:r>
+        <w:rPr/>
+        <w:t>e</w:t>
+      </w:r>
+      <w:r>
+        <w:rPr/>
+        <w:t xml:space="preserve"> </w:t>
+      </w:r>
+      <w:r>
+        <w:rPr/>
+        <w:t>r</w:t>
+      </w:r>
+      <w:r>
+        <w:rPr/>
+        <w:t>e</w:t>
+      </w:r>
+      <w:r>
+        <w:rPr/>
+        <w:t>d</w:t>
+      </w:r>
+      <w:r>
+        <w:rPr/>
+        <w:t>u</w:t>
+      </w:r>
+      <w:r>
+        <w:rPr/>
+        <w:t>z</w:t>
+      </w:r>
+      <w:r>
+        <w:rPr/>
+        <w:t>i</w:t>
+      </w:r>
+      <w:r>
+        <w:rPr/>
+        <w:t>e</w:t>
+      </w:r>
+      <w:r>
+        <w:rPr/>
+        <w:t>r</w:t>
+      </w:r>
+      <w:r>
+        <w:rPr/>
+        <w:t>t</w:t>
+      </w:r>
+      <w:r>
+        <w:rPr/>
+        <w:t xml:space="preserve"> </w:t>
+      </w:r>
+      <w:r>
+        <w:rPr/>
+        <w:t>w</w:t>
+      </w:r>
+      <w:r>
+        <w:rPr/>
+        <w:t>e</w:t>
+      </w:r>
+      <w:r>
+        <w:rPr/>
+        <w:t>i</w:t>
+      </w:r>
+      <w:r>
+        <w:rPr/>
+        <w:t>t</w:t>
+      </w:r>
+      <w:r>
+        <w:rPr/>
+        <w:t>e</w:t>
+      </w:r>
+      <w:r>
+        <w:rPr/>
+        <w:t>r</w:t>
       </w:r>
     </w:p>
     <w:p>
       <w:pPr>
         <w:pStyle w:val="Normal"/>
-        <w:ind w:firstLine="708" w:start="0"/>
-        <w:jc w:val="start"/>
-        <w:rPr/>
-      </w:pPr>
-      <w:r>
-        <w:rPr/>
-        <w:t>Erdölexportierender Länder) -&gt; Hauptsitz Wien</w:t>
+        <w:spacing w:before="0" w:after="80" w:afterAutospacing="off"/>
+        <w:ind w:hanging="0"/>
+      </w:pPr>
+      <w:r>
+        <w:rPr/>
+        <w:t>Deshalb gewisse Inflation (2%/Jahr) gewünscht</w:t>
       </w:r>
     </w:p>
     <w:p>
       <w:pPr>
         <w:pStyle w:val="Normal"/>
-        <w:ind w:firstLine="708" w:start="0"/>
-        <w:jc w:val="start"/>
-        <w:rPr/>
-      </w:pPr>
-      <w:r>
-        <w:rPr/>
-      </w:r>
+        <w:spacing w:before="0" w:after="80" w:afterAutospacing="off"/>
+        <w:ind w:hanging="0"/>
+      </w:pPr>
     </w:p>
     <w:p>
       <w:pPr>
         <w:pStyle w:val="Normal"/>
-        <w:ind w:firstLine="708" w:start="0"/>
-        <w:jc w:val="start"/>
-        <w:rPr/>
-      </w:pPr>
-      <w:r>
-        <w:rPr/>
-        <w:t xml:space="preserve">Das Wettbewerbsmodell geht von der Annahme aus, dass der rational </w:t>
+        <w:spacing w:before="0" w:after="80" w:afterAutospacing="off"/>
+        <w:ind w:hanging="0"/>
+      </w:pPr>
+      <w:r>
+        <w:rPr/>
+        <w:t>Inflation</w:t>
+      </w:r>
+      <w:r>
+        <w:tab/>
+      </w:r>
+      <w:r>
+        <w:tab/>
+      </w:r>
+      <w:r>
+        <w:tab/>
+      </w:r>
+      <w:r>
+        <w:rPr/>
+        <w:t>Deflation</w:t>
       </w:r>
     </w:p>
     <w:p>
       <w:pPr>
         <w:pStyle w:val="Normal"/>
-        <w:ind w:firstLine="708" w:start="0"/>
-        <w:jc w:val="start"/>
-        <w:rPr/>
-      </w:pPr>
-      <w:r>
-        <w:rPr/>
-        <w:t xml:space="preserve">handelnde Mensch alle seine Entscheidungen mit dem Ziel trifft, seinen Gewinn </w:t>
-        <w:tab/>
-        <w:t>zu maximieren -&gt; Homo oeconomicus</w:t>
+        <w:spacing w:before="0" w:after="80" w:afterAutospacing="off"/>
+        <w:ind w:hanging="0"/>
+      </w:pPr>
+      <w:r>
+        <w:rPr/>
+        <w:t>Preissteigerung</w:t>
+      </w:r>
+      <w:r>
+        <w:tab/>
+      </w:r>
+      <w:r>
+        <w:tab/>
+      </w:r>
+      <w:r>
+        <w:rPr/>
+        <w:t>Preissturz</w:t>
       </w:r>
     </w:p>
     <w:p>
       <w:pPr>
         <w:pStyle w:val="Normal"/>
-        <w:ind w:firstLine="708" w:start="0"/>
-        <w:jc w:val="start"/>
-        <w:rPr/>
-      </w:pPr>
-      <w:r>
-        <w:rPr/>
-        <w:t xml:space="preserve">Kann ein Unternehmen nicht bei den Preisen nicht mithalten, scheidet es aus </w:t>
-        <w:tab/>
-        <w:t>dem Markt aus</w:t>
+        <w:spacing w:before="0" w:after="80" w:afterAutospacing="off"/>
+        <w:ind w:hanging="0"/>
+      </w:pPr>
+      <w:r>
+        <w:rPr/>
+        <w:t>Sinken des Gelddwerts</w:t>
+      </w:r>
+      <w:r>
+        <w:tab/>
+      </w:r>
+      <w:r>
+        <w:rPr/>
+        <w:t>Flucht in das Geld</w:t>
       </w:r>
     </w:p>
     <w:p>
       <w:pPr>
         <w:pStyle w:val="Normal"/>
-        <w:ind w:firstLine="708" w:start="0"/>
-        <w:jc w:val="start"/>
-        <w:rPr/>
-      </w:pPr>
-      <w:r>
-        <w:rPr/>
-        <w:t xml:space="preserve">Innovationen treiben die Märkte durch Neuerungen an (z.B. Internet, bessere </w:t>
-        <w:tab/>
-        <w:t>Grafikkarten usw.)</w:t>
+        <w:spacing w:before="0" w:after="80" w:afterAutospacing="off"/>
+        <w:ind w:hanging="0"/>
+      </w:pPr>
+      <w:r>
+        <w:rPr/>
+        <w:t>Flucht in Sachwerte</w:t>
+      </w:r>
+      <w:r>
+        <w:tab/>
+      </w:r>
+      <w:r>
+        <w:tab/>
+      </w:r>
+      <w:r>
+        <w:rPr/>
+        <w:t>Flucht in das Geld</w:t>
       </w:r>
     </w:p>
     <w:p>
       <w:pPr>
         <w:pStyle w:val="Normal"/>
-        <w:ind w:hanging="0" w:start="0"/>
-        <w:jc w:val="start"/>
-        <w:rPr/>
-      </w:pPr>
-      <w:r>
-        <w:rPr/>
-        <w:t>2.5 Produktionsfaktoren</w:t>
+        <w:spacing w:before="0" w:after="80" w:afterAutospacing="off"/>
+        <w:ind w:hanging="0"/>
+      </w:pPr>
+      <w:r>
+        <w:rPr/>
+        <w:t>Nachteile für Gläubiger</w:t>
+      </w:r>
+      <w:r>
+        <w:tab/>
+      </w:r>
+      <w:r>
+        <w:rPr/>
+        <w:t>Vorteile für Gläubiger</w:t>
       </w:r>
     </w:p>
     <w:p>
       <w:pPr>
         <w:pStyle w:val="Normal"/>
-        <w:ind w:hanging="0" w:start="0"/>
-        <w:jc w:val="start"/>
-        <w:rPr/>
-      </w:pPr>
-      <w:r>
-        <w:rPr/>
-        <w:t>Produktionsfaktoren:</w:t>
+        <w:spacing w:before="0" w:after="80" w:afterAutospacing="off"/>
+        <w:ind w:hanging="0"/>
+      </w:pPr>
+      <w:r>
+        <w:rPr/>
+        <w:t>Vorteile für Schuldner</w:t>
+      </w:r>
+      <w:r>
+        <w:tab/>
+      </w:r>
+      <w:r>
+        <w:rPr/>
+        <w:t>Nachteile für Schuldner</w:t>
       </w:r>
     </w:p>
     <w:p>
       <w:pPr>
         <w:pStyle w:val="Normal"/>
-        <w:spacing w:before="0" w:afterAutospacing="0" w:after="0"/>
-        <w:ind w:hanging="0" w:start="0"/>
-        <w:jc w:val="start"/>
-        <w:rPr/>
-      </w:pPr>
-      <w:r>
-        <w:rPr/>
-        <w:t>Grund und Boden (Anbauboden, Abbauboden, Immobilien)</w:t>
-      </w:r>
+        <w:spacing w:before="0" w:after="80" w:afterAutospacing="off"/>
+        <w:ind w:hanging="0"/>
+      </w:pPr>
     </w:p>
     <w:p>
       <w:pPr>
         <w:pStyle w:val="Normal"/>
-        <w:spacing w:before="0" w:afterAutospacing="0" w:after="0"/>
-        <w:ind w:hanging="0" w:start="0"/>
-        <w:jc w:val="start"/>
-        <w:rPr/>
-      </w:pPr>
-      <w:r>
-        <w:rPr/>
-        <w:t>Arbeitskraft (S.87)</w:t>
-      </w:r>
-    </w:p>
-    <w:p>
-      <w:pPr>
-        <w:pStyle w:val="Normal"/>
-        <w:spacing w:before="0" w:afterAutospacing="0" w:after="0"/>
-        <w:ind w:hanging="0" w:start="0"/>
-        <w:jc w:val="start"/>
-        <w:rPr/>
-      </w:pPr>
-      <w:r>
-        <w:rPr/>
-        <w:t>Kapital (Geld oder Human-, Sach-, Anlagekapital)</w:t>
-      </w:r>
-    </w:p>
-    <w:p>
-      <w:pPr>
-        <w:pStyle w:val="Normal"/>
-        <w:spacing w:before="0" w:afterAutospacing="0" w:after="0"/>
-        <w:ind w:hanging="0" w:start="0"/>
-        <w:jc w:val="start"/>
-        <w:rPr/>
-      </w:pPr>
-      <w:r>
-        <w:rPr/>
-        <w:t>Humankapital(Wissen und Bildung) wird immer wichtiger</w:t>
-      </w:r>
-    </w:p>
-    <w:p>
-      <w:pPr>
-        <w:pStyle w:val="Normal"/>
-        <w:ind w:hanging="0" w:start="0"/>
-        <w:jc w:val="start"/>
-        <w:rPr/>
-      </w:pPr>
-      <w:r>
-        <w:rPr/>
-        <w:t>Stand</w:t>
-      </w:r>
-      <w:r>
-        <w:rPr/>
-        <w:t>a</w:t>
-      </w:r>
-      <w:r>
-        <w:rPr/>
-        <w:t>rdfaktoren bestimmen Ortswahl für ein Unternehmen</w:t>
-      </w:r>
-    </w:p>
-    <w:p>
-      <w:pPr>
-        <w:pStyle w:val="Normal"/>
-        <w:spacing w:before="0" w:afterAutospacing="0" w:after="0"/>
-        <w:ind w:hanging="0" w:start="0"/>
-        <w:jc w:val="start"/>
-        <w:rPr/>
-      </w:pPr>
-      <w:r>
-        <w:rPr/>
-        <w:t>Rohstoffe</w:t>
-      </w:r>
-    </w:p>
-    <w:p>
-      <w:pPr>
-        <w:pStyle w:val="Normal"/>
-        <w:spacing w:before="0" w:afterAutospacing="0" w:after="0"/>
-        <w:ind w:hanging="0" w:start="0"/>
-        <w:jc w:val="start"/>
-        <w:rPr/>
-      </w:pPr>
-      <w:r>
-        <w:rPr/>
-        <w:t>Arbeitskräfte</w:t>
-      </w:r>
-    </w:p>
-    <w:p>
-      <w:pPr>
-        <w:pStyle w:val="Normal"/>
-        <w:spacing w:before="0" w:afterAutospacing="0" w:after="0"/>
-        <w:ind w:hanging="0" w:start="0"/>
-        <w:jc w:val="start"/>
-        <w:rPr/>
-      </w:pPr>
-      <w:r>
-        <w:rPr/>
-        <w:t>Absatzmarkt</w:t>
-      </w:r>
-    </w:p>
-    <w:p>
-      <w:pPr>
-        <w:pStyle w:val="Normal"/>
-        <w:spacing w:before="0" w:afterAutospacing="0" w:after="0"/>
-        <w:ind w:hanging="0" w:start="0"/>
-        <w:jc w:val="start"/>
-        <w:rPr/>
-      </w:pPr>
-      <w:r>
-        <w:rPr/>
-        <w:t>Umweltschutzbestimmungen</w:t>
-      </w:r>
-    </w:p>
-    <w:p>
-      <w:pPr>
-        <w:pStyle w:val="Normal"/>
-        <w:spacing w:before="0" w:afterAutospacing="0" w:after="0"/>
-        <w:ind w:hanging="0" w:start="0"/>
-        <w:jc w:val="start"/>
-        <w:rPr/>
-      </w:pPr>
-      <w:r>
-        <w:rPr/>
-        <w:t>Infrastruktur</w:t>
-      </w:r>
-    </w:p>
-    <w:p>
-      <w:pPr>
-        <w:pStyle w:val="Normal"/>
-        <w:spacing w:before="0" w:afterAutospacing="0" w:after="0"/>
-        <w:ind w:hanging="0" w:start="0"/>
-        <w:jc w:val="start"/>
-        <w:rPr/>
-      </w:pPr>
-      <w:r>
-        <w:rPr/>
-        <w:t>Steuern</w:t>
-      </w:r>
-    </w:p>
-    <w:p>
-      <w:pPr>
-        <w:pStyle w:val="Normal"/>
-        <w:spacing w:before="0" w:afterAutospacing="0" w:after="0"/>
-        <w:ind w:hanging="0" w:start="0"/>
-        <w:jc w:val="start"/>
-        <w:rPr/>
-      </w:pPr>
-      <w:r>
-        <w:rPr/>
-        <w:t>Subventionen</w:t>
-      </w:r>
-    </w:p>
-    <w:p>
-      <w:pPr>
-        <w:pStyle w:val="Normal"/>
-        <w:spacing w:before="0" w:afterAutospacing="0" w:after="160"/>
-        <w:ind w:hanging="0" w:start="0"/>
-        <w:jc w:val="start"/>
-        <w:rPr/>
-      </w:pPr>
-      <w:r>
-        <w:rPr/>
-        <w:t>2.6 Geld – Inflation (Inflationsrechner)</w:t>
-      </w:r>
-    </w:p>
-    <w:p>
-      <w:pPr>
-        <w:pStyle w:val="Normal"/>
-        <w:spacing w:before="0" w:afterAutospacing="0" w:after="160"/>
-        <w:ind w:hanging="0" w:start="0"/>
-        <w:jc w:val="start"/>
-        <w:rPr/>
-      </w:pPr>
-      <w:r>
-        <w:rPr/>
-        <w:t>Funktion des Geldes</w:t>
-      </w:r>
-    </w:p>
-    <w:p>
-      <w:pPr>
-        <w:pStyle w:val="Normal"/>
-        <w:spacing w:before="0" w:afterAutospacing="0" w:after="0"/>
-        <w:ind w:hanging="0" w:start="0"/>
-        <w:jc w:val="start"/>
-        <w:rPr/>
-      </w:pPr>
-      <w:r>
-        <w:rPr/>
-        <w:t>Geld ist ein/e</w:t>
-        <w:tab/>
-        <w:tab/>
-        <w:tab/>
-        <w:tab/>
-        <w:t>Schlüsselwörter</w:t>
-      </w:r>
-    </w:p>
-    <w:p>
-      <w:pPr>
-        <w:pStyle w:val="Normal"/>
-        <w:spacing w:before="0" w:afterAutospacing="0" w:after="0"/>
-        <w:ind w:hanging="0" w:start="0"/>
-        <w:jc w:val="start"/>
-        <w:rPr/>
-      </w:pPr>
-      <w:r>
-        <w:rPr/>
-        <w:t>Zahlungsmittel</w:t>
-        <w:tab/>
-        <w:tab/>
-        <w:tab/>
-        <w:t>kaufen, bezahlen</w:t>
-      </w:r>
-    </w:p>
-    <w:p>
-      <w:pPr>
-        <w:pStyle w:val="Normal"/>
-        <w:spacing w:before="0" w:afterAutospacing="0" w:after="0"/>
-        <w:ind w:hanging="0" w:start="0"/>
-        <w:jc w:val="start"/>
-        <w:rPr/>
-      </w:pPr>
-      <w:r>
-        <w:rPr/>
-        <w:t>Aufbewahrungsmittel</w:t>
-        <w:tab/>
-        <w:tab/>
-        <w:t>aufheben, sparen</w:t>
-      </w:r>
-    </w:p>
-    <w:p>
-      <w:pPr>
-        <w:pStyle w:val="Normal"/>
-        <w:spacing w:before="0" w:afterAutospacing="0" w:after="0"/>
-        <w:ind w:hanging="0" w:start="0"/>
-        <w:jc w:val="start"/>
-        <w:rPr/>
-      </w:pPr>
-      <w:r>
-        <w:rPr/>
-        <w:t>Recheneinheit</w:t>
-        <w:tab/>
-        <w:tab/>
-        <w:tab/>
-        <w:t>ausrechnen, vergleichen, günstig</w:t>
-      </w:r>
-    </w:p>
-    <w:p>
-      <w:pPr>
-        <w:pStyle w:val="Normal"/>
-        <w:spacing w:before="0" w:afterAutospacing="0" w:after="80"/>
-        <w:ind w:hanging="0" w:start="0"/>
-        <w:jc w:val="start"/>
-        <w:rPr/>
-      </w:pPr>
-      <w:r>
-        <w:rPr/>
-        <w:t>Geld hat keinen intrinsischen (anders als z.B.: Gold) Wert</w:t>
-      </w:r>
-    </w:p>
-    <w:p>
-      <w:pPr>
-        <w:pStyle w:val="Normal"/>
-        <w:spacing w:before="0" w:afterAutospacing="0" w:after="80"/>
-        <w:ind w:hanging="0" w:start="0"/>
-        <w:jc w:val="start"/>
-        <w:rPr/>
-      </w:pPr>
-      <w:r>
-        <w:rPr/>
-        <w:t>Früher waren Währung teilweise mit Gold gedeckt -&gt; problematisch</w:t>
-      </w:r>
-    </w:p>
-    <w:p>
-      <w:pPr>
-        <w:pStyle w:val="Normal"/>
-        <w:spacing w:before="0" w:afterAutospacing="0" w:after="80"/>
-        <w:ind w:hanging="0" w:start="0"/>
-        <w:jc w:val="start"/>
-        <w:rPr/>
-      </w:pPr>
-      <w:r>
-        <w:rPr/>
-        <w:t>Geld ist eine Schuldverschreibung der Zentralbank</w:t>
-      </w:r>
-    </w:p>
-    <w:p>
-      <w:pPr>
-        <w:pStyle w:val="Normal"/>
-        <w:spacing w:before="0" w:afterAutospacing="0" w:after="80"/>
-        <w:ind w:hanging="0" w:start="0"/>
-        <w:jc w:val="start"/>
-        <w:rPr/>
-      </w:pPr>
-      <w:r>
-        <w:rPr/>
-        <w:t xml:space="preserve">Früher war Gold das Zahlungsmittele -&gt; König hatte nicht genug Gold, um </w:t>
-        <w:tab/>
-        <w:tab/>
-        <w:t xml:space="preserve">Menschen zu bezahlen -&gt; hat Gold mit anderen Materialien gemischt -&gt; Mehr </w:t>
-        <w:tab/>
-        <w:t>“Gold” -&gt; Inflation</w:t>
-      </w:r>
-    </w:p>
-    <w:p>
-      <w:pPr>
-        <w:pStyle w:val="Normal"/>
-        <w:spacing w:before="0" w:afterAutospacing="0" w:after="80"/>
-        <w:ind w:hanging="0" w:start="0"/>
-        <w:jc w:val="start"/>
-        <w:rPr/>
-      </w:pPr>
-      <w:r>
-        <w:rPr/>
-        <w:t>Löhne werden jedes Jahr an die Inflation angepasst und somit erhöht</w:t>
-      </w:r>
+        <w:spacing w:before="0" w:after="80" w:afterAutospacing="off"/>
+        <w:ind w:hanging="0"/>
+      </w:pPr>
     </w:p>
     <w:sectPr>
       <w:headerReference w:type="even" r:id="rId3"/>
@@ -2240,12 +2785,13 @@
       <w:footerReference w:type="default" r:id="rId7"/>
       <w:footerReference w:type="first" r:id="rId8"/>
       <w:type w:val="nextPage"/>
-      <w:pgSz w:w="11906" w:h="16838"/>
-      <w:pgMar w:left="1440" w:right="1440" w:gutter="0" w:header="720" w:top="1440" w:footer="720" w:bottom="1440"/>
+      <w:pgSz w:w="11906" w:h="16838" w:orient="portrait"/>
+      <w:pgMar w:top="1440" w:right="1440" w:bottom="1440" w:left="1440" w:header="720" w:footer="720" w:gutter="0"/>
       <w:pgNumType w:fmt="decimal"/>
       <w:formProt w:val="false"/>
       <w:textDirection w:val="lrTb"/>
       <w:docGrid w:type="default" w:linePitch="360" w:charSpace="0"/>
+      <w:cols w:num="1"/>
     </w:sectPr>
   </w:body>
 </w:document>
@@ -2253,7 +2799,7 @@
 
 <file path=word/footer1.xml><?xml version="1.0" encoding="utf-8"?>
 <w:ftr xmlns:o="urn:schemas-microsoft-com:office:office" xmlns:r="http://schemas.openxmlformats.org/officeDocument/2006/relationships" xmlns:v="urn:schemas-microsoft-com:vml" xmlns:w="http://schemas.openxmlformats.org/wordprocessingml/2006/main" xmlns:w10="urn:schemas-microsoft-com:office:word" xmlns:wp="http://schemas.openxmlformats.org/drawingml/2006/wordprocessingDrawing" xmlns:pic="http://schemas.openxmlformats.org/drawingml/2006/picture" xmlns:wps="http://schemas.microsoft.com/office/word/2010/wordprocessingShape" xmlns:wpg="http://schemas.microsoft.com/office/word/2010/wordprocessingGroup" xmlns:mc="http://schemas.openxmlformats.org/markup-compatibility/2006" xmlns:wp14="http://schemas.microsoft.com/office/word/2010/wordprocessingDrawing" xmlns:w14="http://schemas.microsoft.com/office/word/2010/wordml" xmlns:w15="http://schemas.microsoft.com/office/word/2012/wordml" mc:Ignorable="w14 wp14 w15">
-  <w:p>
+  <w:p xmlns:wp14="http://schemas.microsoft.com/office/word/2010/wordml" wp14:textId="77777777">
     <w:pPr>
       <w:pStyle w:val="Footer"/>
       <w:rPr/>
@@ -2280,14 +2826,14 @@
         <w:bottom w:w="0" w:type="dxa"/>
         <w:end w:w="108" w:type="dxa"/>
       </w:tblCellMar>
-      <w:tblLook w:val="06a0" w:noHBand="1" w:noVBand="1" w:firstColumn="1" w:lastRow="0" w:lastColumn="0" w:firstRow="1"/>
+      <w:tblLook w:val="06a0" w:firstRow="1" w:lastRow="0" w:firstColumn="1" w:lastColumn="0" w:noHBand="1" w:noVBand="1"/>
     </w:tblPr>
     <w:tblGrid>
       <w:gridCol w:w="3005"/>
       <w:gridCol w:w="3005"/>
       <w:gridCol w:w="3005"/>
     </w:tblGrid>
-    <w:tr>
+    <w:tr xmlns:wp14="http://schemas.microsoft.com/office/word/2010/wordml" wp14:textId="77777777">
       <w:trPr>
         <w:trHeight w:val="300" w:hRule="atLeast"/>
       </w:trPr>
@@ -2296,7 +2842,7 @@
           <w:tcW w:w="3005" w:type="dxa"/>
           <w:tcBorders/>
         </w:tcPr>
-        <w:p>
+        <w:p wp14:textId="77777777">
           <w:pPr>
             <w:pStyle w:val="Header"/>
             <w:widowControl/>
@@ -2328,7 +2874,7 @@
           <w:tcW w:w="3005" w:type="dxa"/>
           <w:tcBorders/>
         </w:tcPr>
-        <w:p>
+        <w:p wp14:textId="77777777">
           <w:pPr>
             <w:pStyle w:val="Header"/>
             <w:widowControl/>
@@ -2359,7 +2905,7 @@
           <w:tcW w:w="3005" w:type="dxa"/>
           <w:tcBorders/>
         </w:tcPr>
-        <w:p>
+        <w:p wp14:textId="77777777">
           <w:pPr>
             <w:pStyle w:val="Header"/>
             <w:widowControl/>
@@ -2388,7 +2934,7 @@
       </w:tc>
     </w:tr>
   </w:tbl>
-  <w:p>
+  <w:p xmlns:wp14="http://schemas.microsoft.com/office/word/2010/wordml" wp14:textId="77777777">
     <w:pPr>
       <w:pStyle w:val="Footer"/>
       <w:bidi w:val="0"/>
@@ -2416,14 +2962,14 @@
         <w:bottom w:w="0" w:type="dxa"/>
         <w:end w:w="108" w:type="dxa"/>
       </w:tblCellMar>
-      <w:tblLook w:val="06a0" w:noHBand="1" w:noVBand="1" w:firstColumn="1" w:lastRow="0" w:lastColumn="0" w:firstRow="1"/>
+      <w:tblLook w:val="06a0" w:firstRow="1" w:lastRow="0" w:firstColumn="1" w:lastColumn="0" w:noHBand="1" w:noVBand="1"/>
     </w:tblPr>
     <w:tblGrid>
       <w:gridCol w:w="3005"/>
       <w:gridCol w:w="3005"/>
       <w:gridCol w:w="3005"/>
     </w:tblGrid>
-    <w:tr>
+    <w:tr xmlns:wp14="http://schemas.microsoft.com/office/word/2010/wordml" wp14:textId="77777777">
       <w:trPr>
         <w:trHeight w:val="300" w:hRule="atLeast"/>
       </w:trPr>
@@ -2432,7 +2978,7 @@
           <w:tcW w:w="3005" w:type="dxa"/>
           <w:tcBorders/>
         </w:tcPr>
-        <w:p>
+        <w:p wp14:textId="77777777">
           <w:pPr>
             <w:pStyle w:val="Header"/>
             <w:widowControl/>
@@ -2464,7 +3010,7 @@
           <w:tcW w:w="3005" w:type="dxa"/>
           <w:tcBorders/>
         </w:tcPr>
-        <w:p>
+        <w:p wp14:textId="77777777">
           <w:pPr>
             <w:pStyle w:val="Header"/>
             <w:widowControl/>
@@ -2495,7 +3041,7 @@
           <w:tcW w:w="3005" w:type="dxa"/>
           <w:tcBorders/>
         </w:tcPr>
-        <w:p>
+        <w:p wp14:textId="77777777">
           <w:pPr>
             <w:pStyle w:val="Header"/>
             <w:widowControl/>
@@ -2524,7 +3070,7 @@
       </w:tc>
     </w:tr>
   </w:tbl>
-  <w:p>
+  <w:p xmlns:wp14="http://schemas.microsoft.com/office/word/2010/wordml" wp14:textId="77777777">
     <w:pPr>
       <w:pStyle w:val="Footer"/>
       <w:bidi w:val="0"/>
@@ -2539,7 +3085,7 @@
 
 <file path=word/header1.xml><?xml version="1.0" encoding="utf-8"?>
 <w:hdr xmlns:o="urn:schemas-microsoft-com:office:office" xmlns:r="http://schemas.openxmlformats.org/officeDocument/2006/relationships" xmlns:v="urn:schemas-microsoft-com:vml" xmlns:w="http://schemas.openxmlformats.org/wordprocessingml/2006/main" xmlns:w10="urn:schemas-microsoft-com:office:word" xmlns:wp="http://schemas.openxmlformats.org/drawingml/2006/wordprocessingDrawing" xmlns:pic="http://schemas.openxmlformats.org/drawingml/2006/picture" xmlns:wps="http://schemas.microsoft.com/office/word/2010/wordprocessingShape" xmlns:wpg="http://schemas.microsoft.com/office/word/2010/wordprocessingGroup" xmlns:mc="http://schemas.openxmlformats.org/markup-compatibility/2006" xmlns:wp14="http://schemas.microsoft.com/office/word/2010/wordprocessingDrawing" xmlns:w14="http://schemas.microsoft.com/office/word/2010/wordml" xmlns:w15="http://schemas.microsoft.com/office/word/2012/wordml" mc:Ignorable="w14 wp14 w15">
-  <w:p>
+  <w:p xmlns:wp14="http://schemas.microsoft.com/office/word/2010/wordml" wp14:textId="77777777">
     <w:pPr>
       <w:pStyle w:val="Header"/>
       <w:rPr/>
@@ -2566,14 +3112,14 @@
         <w:bottom w:w="0" w:type="dxa"/>
         <w:end w:w="108" w:type="dxa"/>
       </w:tblCellMar>
-      <w:tblLook w:val="06a0" w:noHBand="1" w:noVBand="1" w:firstColumn="1" w:lastRow="0" w:lastColumn="0" w:firstRow="1"/>
+      <w:tblLook w:val="06a0" w:firstRow="1" w:lastRow="0" w:firstColumn="1" w:lastColumn="0" w:noHBand="1" w:noVBand="1"/>
     </w:tblPr>
     <w:tblGrid>
       <w:gridCol w:w="3005"/>
       <w:gridCol w:w="3005"/>
       <w:gridCol w:w="3005"/>
     </w:tblGrid>
-    <w:tr>
+    <w:tr xmlns:wp14="http://schemas.microsoft.com/office/word/2010/wordml" wp14:textId="77777777">
       <w:trPr>
         <w:trHeight w:val="300" w:hRule="atLeast"/>
       </w:trPr>
@@ -2582,7 +3128,7 @@
           <w:tcW w:w="3005" w:type="dxa"/>
           <w:tcBorders/>
         </w:tcPr>
-        <w:p>
+        <w:p wp14:textId="77777777">
           <w:pPr>
             <w:pStyle w:val="Header"/>
             <w:widowControl/>
@@ -2614,7 +3160,7 @@
           <w:tcW w:w="3005" w:type="dxa"/>
           <w:tcBorders/>
         </w:tcPr>
-        <w:p>
+        <w:p wp14:textId="77777777">
           <w:pPr>
             <w:pStyle w:val="Header"/>
             <w:widowControl/>
@@ -2645,7 +3191,7 @@
           <w:tcW w:w="3005" w:type="dxa"/>
           <w:tcBorders/>
         </w:tcPr>
-        <w:p>
+        <w:p wp14:textId="77777777">
           <w:pPr>
             <w:pStyle w:val="Header"/>
             <w:widowControl/>
@@ -2675,7 +3221,7 @@
       </w:tc>
     </w:tr>
   </w:tbl>
-  <w:p>
+  <w:p xmlns:wp14="http://schemas.microsoft.com/office/word/2010/wordml" wp14:textId="77777777">
     <w:pPr>
       <w:pStyle w:val="Header"/>
       <w:bidi w:val="0"/>
@@ -2703,14 +3249,14 @@
         <w:bottom w:w="0" w:type="dxa"/>
         <w:end w:w="108" w:type="dxa"/>
       </w:tblCellMar>
-      <w:tblLook w:val="06a0" w:noHBand="1" w:noVBand="1" w:firstColumn="1" w:lastRow="0" w:lastColumn="0" w:firstRow="1"/>
+      <w:tblLook w:val="06a0" w:firstRow="1" w:lastRow="0" w:firstColumn="1" w:lastColumn="0" w:noHBand="1" w:noVBand="1"/>
     </w:tblPr>
     <w:tblGrid>
       <w:gridCol w:w="3005"/>
       <w:gridCol w:w="3005"/>
       <w:gridCol w:w="3005"/>
     </w:tblGrid>
-    <w:tr>
+    <w:tr xmlns:wp14="http://schemas.microsoft.com/office/word/2010/wordml" wp14:textId="77777777">
       <w:trPr>
         <w:trHeight w:val="300" w:hRule="atLeast"/>
       </w:trPr>
@@ -2719,7 +3265,7 @@
           <w:tcW w:w="3005" w:type="dxa"/>
           <w:tcBorders/>
         </w:tcPr>
-        <w:p>
+        <w:p wp14:textId="77777777">
           <w:pPr>
             <w:pStyle w:val="Header"/>
             <w:widowControl/>
@@ -2751,7 +3297,7 @@
           <w:tcW w:w="3005" w:type="dxa"/>
           <w:tcBorders/>
         </w:tcPr>
-        <w:p>
+        <w:p wp14:textId="77777777">
           <w:pPr>
             <w:pStyle w:val="Header"/>
             <w:widowControl/>
@@ -2782,7 +3328,7 @@
           <w:tcW w:w="3005" w:type="dxa"/>
           <w:tcBorders/>
         </w:tcPr>
-        <w:p>
+        <w:p wp14:textId="77777777">
           <w:pPr>
             <w:pStyle w:val="Header"/>
             <w:widowControl/>
@@ -2812,7 +3358,7 @@
       </w:tc>
     </w:tr>
   </w:tbl>
-  <w:p>
+  <w:p xmlns:wp14="http://schemas.microsoft.com/office/word/2010/wordml" wp14:textId="77777777">
     <w:pPr>
       <w:pStyle w:val="Header"/>
       <w:bidi w:val="0"/>
@@ -2826,11 +3372,11 @@
 </file>
 
 <file path=word/styles.xml><?xml version="1.0" encoding="utf-8"?>
-<w:styles xmlns:w="http://schemas.openxmlformats.org/wordprocessingml/2006/main" xmlns:w14="http://schemas.microsoft.com/office/word/2010/wordml" xmlns:mc="http://schemas.openxmlformats.org/markup-compatibility/2006" mc:Ignorable="w14">
+<w:styles xmlns:wp14="http://schemas.microsoft.com/office/word/2010/wordprocessingDrawing" xmlns:w="http://schemas.openxmlformats.org/wordprocessingml/2006/main" xmlns:w14="http://schemas.microsoft.com/office/word/2010/wordml" xmlns:mc="http://schemas.openxmlformats.org/markup-compatibility/2006" mc:Ignorable="w14 wp14">
   <w:docDefaults>
     <w:rPrDefault>
       <w:rPr>
-        <w:rFonts w:ascii="Aptos" w:hAnsi="Aptos" w:eastAsia="Aptos" w:cs="" w:asciiTheme="minorHAnsi" w:cstheme="minorBidi" w:eastAsiaTheme="minorHAnsi" w:hAnsiTheme="minorHAnsi"/>
+        <w:rFonts w:ascii="Aptos" w:hAnsi="Aptos" w:eastAsia="Aptos" w:cs="" w:asciiTheme="minorHAnsi" w:hAnsiTheme="minorHAnsi" w:eastAsiaTheme="minorHAnsi" w:cstheme="minorBidi"/>
         <w:sz w:val="24"/>
         <w:szCs w:val="24"/>
         <w:lang w:val="de-DE" w:eastAsia="en-US" w:bidi="ar-SA"/>
@@ -3221,11 +3767,11 @@
     <w:pPr>
       <w:widowControl/>
       <w:bidi w:val="0"/>
-      <w:spacing w:lineRule="auto" w:line="278" w:before="0" w:after="160"/>
+      <w:spacing w:before="0" w:after="160" w:line="278" w:lineRule="auto"/>
       <w:jc w:val="start"/>
     </w:pPr>
     <w:rPr>
-      <w:rFonts w:ascii="Aptos" w:hAnsi="Aptos" w:eastAsia="Aptos" w:cs="" w:asciiTheme="minorHAnsi" w:cstheme="minorBidi" w:eastAsiaTheme="minorHAnsi" w:hAnsiTheme="minorHAnsi"/>
+      <w:rFonts w:ascii="Aptos" w:hAnsi="Aptos" w:eastAsia="Aptos" w:cs="" w:asciiTheme="minorHAnsi" w:hAnsiTheme="minorHAnsi" w:eastAsiaTheme="minorHAnsi" w:cstheme="minorBidi"/>
       <w:color w:val="auto"/>
       <w:kern w:val="0"/>
       <w:sz w:val="24"/>
@@ -3260,7 +3806,7 @@
     <w:name w:val="Body Text"/>
     <w:basedOn w:val="Normal"/>
     <w:pPr>
-      <w:spacing w:lineRule="auto" w:line="276" w:before="0" w:after="140"/>
+      <w:spacing w:before="0" w:after="140" w:line="276" w:lineRule="auto"/>
     </w:pPr>
     <w:rPr/>
   </w:style>
@@ -3328,10 +3874,10 @@
     <w:pPr>
       <w:tabs>
         <w:tab w:val="clear" w:pos="708"/>
-        <w:tab w:val="center" w:pos="4680" w:leader="none"/>
-        <w:tab w:val="right" w:pos="9360" w:leader="none"/>
+        <w:tab w:val="center" w:leader="none" w:pos="4680"/>
+        <w:tab w:val="right" w:leader="none" w:pos="9360"/>
       </w:tabs>
-      <w:spacing w:lineRule="auto" w:line="240" w:before="0" w:after="0"/>
+      <w:spacing w:before="0" w:after="0" w:line="240" w:lineRule="auto"/>
     </w:pPr>
     <w:rPr/>
   </w:style>
@@ -3344,10 +3890,10 @@
     <w:pPr>
       <w:tabs>
         <w:tab w:val="clear" w:pos="708"/>
-        <w:tab w:val="center" w:pos="4680" w:leader="none"/>
-        <w:tab w:val="right" w:pos="9360" w:leader="none"/>
+        <w:tab w:val="center" w:leader="none" w:pos="4680"/>
+        <w:tab w:val="right" w:leader="none" w:pos="9360"/>
       </w:tabs>
-      <w:spacing w:lineRule="auto" w:line="240" w:before="0" w:after="0"/>
+      <w:spacing w:before="0" w:after="0" w:line="240" w:lineRule="auto"/>
     </w:pPr>
     <w:rPr/>
   </w:style>
@@ -3358,7 +3904,7 @@
     <w:unhideWhenUsed/>
     <w:qFormat/>
   </w:style>
-  <w:style w:type="table" w:default="1" w:styleId="TableNormal">
+  <w:style w:type="table" w:styleId="TableNormal" w:default="1">
     <w:name w:val="Normal Table"/>
     <w:uiPriority w:val="99"/>
     <w:semiHidden/>

</xml_diff>